<commit_message>
Rename Max Pulse to Silvernorth Pulse HRV in Word document
Co-Authored-By: Claude Opus 5.5 <noreply@anthropic.com>
Claude-Session: https://claude.ai/code/session_01UgwrmmbD9PM9EmPwRWhoBq
</commit_message>
<xml_diff>
--- a/PulseMaxWebsite.docx
+++ b/PulseMaxWebsite.docx
@@ -7,7 +7,7 @@
         <w:pStyle w:val="Title"/>
       </w:pPr>
       <w:r>
-        <w:t>Long Life Cardio – Max Pulse</w:t>
+        <w:t xml:space="preserve">Long Life Cardio – Silvernorth Pulse HRV</w:t>
       </w:r>
     </w:p>
     <w:p>
@@ -47,7 +47,7 @@
         <w:pStyle w:val="Compact"/>
       </w:pPr>
       <w:r>
-        <w:t>3. Max Pulse - Cardiovascular Screening Device Sales and Support</w:t>
+        <w:t xml:space="preserve">3. Silvernorth Pulse HRV - Cardiovascular Screening Device Sales and Support</w:t>
       </w:r>
     </w:p>
     <w:p>
@@ -55,7 +55,7 @@
         <w:pStyle w:val="Compact"/>
       </w:pPr>
       <w:r>
-        <w:t>4. Max Pulse FDA Clearance</w:t>
+        <w:t xml:space="preserve">4. Silvernorth Pulse HRV FDA Clearance</w:t>
       </w:r>
     </w:p>
     <w:p>
@@ -63,7 +63,7 @@
         <w:pStyle w:val="Compact"/>
       </w:pPr>
       <w:r>
-        <w:t>5. Max Pulse Test- Usage Guide</w:t>
+        <w:t xml:space="preserve">5. Silvernorth Pulse HRV Test- Usage Guide</w:t>
       </w:r>
     </w:p>
     <w:p>
@@ -71,7 +71,7 @@
         <w:pStyle w:val="Compact"/>
       </w:pPr>
       <w:r>
-        <w:t>6. Max Pulse Test - Detailed Reports</w:t>
+        <w:t xml:space="preserve">6. Silvernorth Pulse HRV Test - Detailed Reports</w:t>
       </w:r>
     </w:p>
     <w:p>
@@ -79,7 +79,7 @@
         <w:pStyle w:val="Compact"/>
       </w:pPr>
       <w:r>
-        <w:t>7. Max Pulse Pricing</w:t>
+        <w:t xml:space="preserve">7. Silvernorth Pulse HRV Pricing</w:t>
       </w:r>
     </w:p>
     <w:p>
@@ -87,7 +87,7 @@
         <w:pStyle w:val="Compact"/>
       </w:pPr>
       <w:r>
-        <w:t>8. Max Pulse Value to Clinic</w:t>
+        <w:t xml:space="preserve">8. Silvernorth Pulse HRV Value to Clinic</w:t>
       </w:r>
     </w:p>
     <w:p>
@@ -95,7 +95,7 @@
         <w:pStyle w:val="Compact"/>
       </w:pPr>
       <w:r>
-        <w:t>9. Max Pulse Device for GPs and Family Practices</w:t>
+        <w:t xml:space="preserve">9. Silvernorth Pulse HRV Device for GPs and Family Practices</w:t>
       </w:r>
     </w:p>
     <w:p>
@@ -207,7 +207,7 @@
         <w:pStyle w:val="Compact"/>
       </w:pPr>
       <w:r>
-        <w:t>23. Max Pulse Training Videos</w:t>
+        <w:t xml:space="preserve">23. Silvernorth Pulse HRV Training Videos</w:t>
       </w:r>
     </w:p>
     <w:p>
@@ -215,7 +215,7 @@
         <w:pStyle w:val="Compact"/>
       </w:pPr>
       <w:r>
-        <w:t>24. Max Pulse Support</w:t>
+        <w:t xml:space="preserve">24. Silvernorth Pulse HRV Support</w:t>
       </w:r>
     </w:p>
     <w:p>
@@ -223,7 +223,7 @@
         <w:pStyle w:val="Compact"/>
       </w:pPr>
       <w:r>
-        <w:t>25. Max Pulse Troubleshooting</w:t>
+        <w:t xml:space="preserve">25. Silvernorth Pulse HRV Troubleshooting</w:t>
       </w:r>
     </w:p>
     <w:p>
@@ -255,7 +255,7 @@
         <w:pStyle w:val="Compact"/>
       </w:pPr>
       <w:r>
-        <w:t>29. Max Pulse Testing Directory</w:t>
+        <w:t xml:space="preserve">29. Silvernorth Pulse HRV Testing Directory</w:t>
       </w:r>
     </w:p>
     <w:p>
@@ -313,7 +313,7 @@
         <w:pStyle w:val="Heading3"/>
       </w:pPr>
       <w:r>
-        <w:t xml:space="preserve">The Max Pulse</w:t>
+        <w:t xml:space="preserve">The Silvernorth Pulse HRV</w:t>
       </w:r>
       <w:r>
         <w:br/>
@@ -361,7 +361,7 @@
         <w:t xml:space="preserve"> </w:t>
       </w:r>
       <w:r>
-        <w:t xml:space="preserve">The Max Pulse Screening Device</w:t>
+        <w:t xml:space="preserve">The Silvernorth Pulse HRV Screening Device</w:t>
       </w:r>
       <w:r>
         <w:t xml:space="preserve"> </w:t>
@@ -373,7 +373,7 @@
         <w:pStyle w:val="Heading3"/>
       </w:pPr>
       <w:r>
-        <w:t xml:space="preserve">A Video Introduction to the Max Pulse</w:t>
+        <w:t xml:space="preserve">A Video Introduction to the Silvernorth Pulse HRV</w:t>
       </w:r>
     </w:p>
     <w:bookmarkEnd w:id="22"/>
@@ -382,7 +382,7 @@
         <w:pStyle w:val="FirstParagraph"/>
       </w:pPr>
       <w:r>
-        <w:t xml:space="preserve">This 4 minute video will explain how to use the Max Pulse and the benefits it can offer to your medical practice.</w:t>
+        <w:t xml:space="preserve">This 4 minute video will explain how to use the Silvernorth Pulse HRV and the benefits it can offer to your medical practice.</w:t>
       </w:r>
     </w:p>
     <w:bookmarkStart w:id="23" w:name="max-pulse-cardiovascular-testing"/>
@@ -391,7 +391,7 @@
         <w:pStyle w:val="Heading3"/>
       </w:pPr>
       <w:r>
-        <w:t xml:space="preserve">Max Pulse Cardiovascular Testing</w:t>
+        <w:t xml:space="preserve">Silvernorth Pulse HRV Cardiovascular Testing</w:t>
       </w:r>
     </w:p>
     <w:bookmarkEnd w:id="23"/>
@@ -447,7 +447,7 @@
         <w:pStyle w:val="BodyText"/>
       </w:pPr>
       <w:r>
-        <w:t xml:space="preserve">The Max Pulse will show you in just 1 minute if your patient is suffering from arterial wall stiffness and gives you an accurate estimate of the biological age of the arteries.</w:t>
+        <w:t xml:space="preserve">The Silvernorth Pulse HRV will show you in just 1 minute if your patient is suffering from arterial wall stiffness and gives you an accurate estimate of the biological age of the arteries.</w:t>
       </w:r>
     </w:p>
     <w:p>
@@ -463,7 +463,7 @@
         <w:pStyle w:val="BodyText"/>
       </w:pPr>
       <w:r>
-        <w:t xml:space="preserve">The Max Pulse can help Healthcare Practitioners reduce cardiovascular disease in their patient populations through early detection and prevention and assist to decrease the incidents and trauma associated with the cardiovascular system.</w:t>
+        <w:t xml:space="preserve">The Silvernorth Pulse HRV can help Healthcare Practitioners reduce cardiovascular disease in their patient populations through early detection and prevention and assist to decrease the incidents and trauma associated with the cardiovascular system.</w:t>
       </w:r>
     </w:p>
     <w:p>
@@ -525,7 +525,7 @@
         <w:pStyle w:val="FirstParagraph"/>
       </w:pPr>
       <w:r>
-        <w:t xml:space="preserve">Long Life Cardio LLC is based in Wimberley, Texas and provides Max Pulse Sales and Support for all of the United States.</w:t>
+        <w:t xml:space="preserve">Long Life Cardio LLC is based in Wimberley, Texas and provides Silvernorth Pulse HRV Sales and Support for all of the United States.</w:t>
       </w:r>
     </w:p>
     <w:p>
@@ -587,7 +587,7 @@
         <w:pStyle w:val="BodyText"/>
       </w:pPr>
       <w:r>
-        <w:t xml:space="preserve">We distribute the Max Pulse Device.</w:t>
+        <w:t xml:space="preserve">We distribute the Silvernorth Pulse HRV Device.</w:t>
       </w:r>
     </w:p>
     <w:p>
@@ -621,7 +621,7 @@
         <w:pStyle w:val="Heading5"/>
       </w:pPr>
       <w:r>
-        <w:t xml:space="preserve">The Max Pulse</w:t>
+        <w:t xml:space="preserve">The Silvernorth Pulse HRV</w:t>
       </w:r>
     </w:p>
     <w:p>
@@ -681,7 +681,7 @@
         <w:t xml:space="preserve"> </w:t>
       </w:r>
       <w:r>
-        <w:t xml:space="preserve">The Max Pulse comes with a 1-year factory warranty and is also available with an extended 5-year warranty.</w:t>
+        <w:t xml:space="preserve">The Silvernorth Pulse HRV comes with a 1-year factory warranty and is also available with an extended 5-year warranty.</w:t>
       </w:r>
     </w:p>
     <w:p>
@@ -699,7 +699,7 @@
         <w:t xml:space="preserve"> </w:t>
       </w:r>
       <w:r>
-        <w:t xml:space="preserve">We service the Max Pulse devices as needed. Cost is dependent on the issue. In some very rare instances, the devices do have to be returned to the manufacturer for repair.</w:t>
+        <w:t xml:space="preserve">We service the Silvernorth Pulse HRV devices as needed. Cost is dependent on the issue. In some very rare instances, the devices do have to be returned to the manufacturer for repair.</w:t>
       </w:r>
     </w:p>
     <w:p>
@@ -732,7 +732,7 @@
         <w:t xml:space="preserve"> </w:t>
       </w:r>
       <w:r>
-        <w:t xml:space="preserve">We can troubleshoot your Max Pulse device.</w:t>
+        <w:t xml:space="preserve">We can troubleshoot your Silvernorth Pulse HRV device.</w:t>
       </w:r>
     </w:p>
     <w:bookmarkEnd w:id="33"/>
@@ -808,7 +808,7 @@
         <w:pStyle w:val="FirstParagraph"/>
       </w:pPr>
       <w:r>
-        <w:t xml:space="preserve">After working for the company that first distributed the Max Pulse in the USA, Wayne took over the distribution when the previous owner retired. Having worked with the Max Pulse and the earlier devices that were the forerunners to this device, Wayne has a deep knowledge of the equipment. Wayne also consults with our directors to ensure websites are kept up, oversees internet advertising, and that the best possible marketing strategies are used. With his long experience he is able to support owners who have more complex technical questions.</w:t>
+        <w:t xml:space="preserve">After working for the company that first distributed the Silvernorth Pulse HRV in the USA, Wayne took over the distribution when the previous owner retired. Having worked with the Silvernorth Pulse HRV and the earlier devices that were the forerunners to this device, Wayne has a deep knowledge of the equipment. Wayne also consults with our directors to ensure websites are kept up, oversees internet advertising, and that the best possible marketing strategies are used. With his long experience he is able to support owners who have more complex technical questions.</w:t>
       </w:r>
     </w:p>
     <w:bookmarkEnd w:id="39"/>
@@ -949,7 +949,7 @@
         <w:pStyle w:val="Heading1"/>
       </w:pPr>
       <w:r>
-        <w:t xml:space="preserve">Max Pulse - Cardiovascular Screening Device Sales and Support</w:t>
+        <w:t xml:space="preserve">Silvernorth Pulse HRV - Cardiovascular Screening Device Sales and Support</w:t>
       </w:r>
     </w:p>
     <w:p>
@@ -961,7 +961,7 @@
           <wp:inline>
             <wp:extent cx="5029200" cy="2910649"/>
             <wp:effectExtent b="0" l="0" r="0" t="0"/>
-            <wp:docPr descr="max pulse" title="" id="50" name="Picture"/>
+            <wp:docPr descr="Silvernorth Pulse HRV" title="" id="50" name="Picture"/>
             <a:graphic>
               <a:graphicData uri="http://schemas.openxmlformats.org/drawingml/2006/picture">
                 <pic:pic>
@@ -1043,15 +1043,15 @@
         <w:pStyle w:val="FirstParagraph"/>
       </w:pPr>
       <w:r>
-        <w:t xml:space="preserve">The Max Pulse is a great resource for any type of Healthcare Practitioner or health-related business or profession because it provides a simple and non-invasive means of determining the health of the cardiovascular system.</w:t>
-      </w:r>
-    </w:p>
-    <w:p>
-      <w:pPr>
-        <w:pStyle w:val="BodyText"/>
-      </w:pPr>
-      <w:r>
-        <w:t xml:space="preserve">Max Pulse testing will give you a detailed analysis of arterial health, along with a separate report containing a detailed analysis of the autonomic nervous system and stress/fatigue levels.</w:t>
+        <w:t xml:space="preserve">The Silvernorth Pulse HRV is a great resource for any type of Healthcare Practitioner or health-related business or profession because it provides a simple and non-invasive means of determining the health of the cardiovascular system.</w:t>
+      </w:r>
+    </w:p>
+    <w:p>
+      <w:pPr>
+        <w:pStyle w:val="BodyText"/>
+      </w:pPr>
+      <w:r>
+        <w:t xml:space="preserve">Silvernorth Pulse HRV testing will give you a detailed analysis of arterial health, along with a separate report containing a detailed analysis of the autonomic nervous system and stress/fatigue levels.</w:t>
       </w:r>
     </w:p>
     <w:bookmarkStart w:id="56" w:name="get-your-max-pulse-today"/>
@@ -1060,7 +1060,7 @@
         <w:pStyle w:val="Heading4"/>
       </w:pPr>
       <w:r>
-        <w:t xml:space="preserve">Get Your Max Pulse Today!</w:t>
+        <w:t xml:space="preserve">Get Your Silvernorth Pulse HRV Today!</w:t>
       </w:r>
     </w:p>
     <w:bookmarkStart w:id="55" w:name="X1c593f86af5482f32613476ef31395ae9511cb9"/>
@@ -1079,7 +1079,7 @@
         <w:br/>
       </w:r>
       <w:r>
-        <w:t xml:space="preserve">(Includes Max Pulse with Accessories, and Laptop with Software.</w:t>
+        <w:t xml:space="preserve">(Includes Silvernorth Pulse HRV with Accessories, and Laptop with Software.</w:t>
       </w:r>
       <w:r>
         <w:br/>
@@ -1109,7 +1109,7 @@
         <w:pStyle w:val="Heading4"/>
       </w:pPr>
       <w:r>
-        <w:t xml:space="preserve">Video Introduction to the Max Pulse</w:t>
+        <w:t xml:space="preserve">Video Introduction to the Silvernorth Pulse HRV</w:t>
       </w:r>
     </w:p>
     <w:bookmarkEnd w:id="57"/>
@@ -1138,7 +1138,7 @@
         <w:pStyle w:val="FirstParagraph"/>
       </w:pPr>
       <w:r>
-        <w:t xml:space="preserve">The Max Pulse test is non-invasive and uses a photoelectric clip on the fingertip</w:t>
+        <w:t xml:space="preserve">The Silvernorth Pulse HRV test is non-invasive and uses a photoelectric clip on the fingertip</w:t>
       </w:r>
       <w:r>
         <w:rPr>
@@ -1148,7 +1148,7 @@
         <w:t xml:space="preserve">. </w:t>
       </w:r>
       <w:r>
-        <w:t xml:space="preserve">By measuring the blood at the fingertip, the Max Pulse can graph the heartbeat as it moves through systolic and diastolic. When a person’s arteries are flexible, the pressure at the fingertip has specific deviations as the arteries flex. If the person’s arteries are very stiff, the graph becomes very tight and regular. The machine performs an analysis of the arterial pulse wave by using a very sophisticated algorithm to track variations in the graph that are not visible to the naked eye and then interprets those results against a large body of research. The result is an assessment of arterial hardening that is very accurate.</w:t>
+        <w:t xml:space="preserve">By measuring the blood at the fingertip, the Silvernorth Pulse HRV can graph the heartbeat as it moves through systolic and diastolic. When a person’s arteries are flexible, the pressure at the fingertip has specific deviations as the arteries flex. If the person’s arteries are very stiff, the graph becomes very tight and regular. The machine performs an analysis of the arterial pulse wave by using a very sophisticated algorithm to track variations in the graph that are not visible to the naked eye and then interprets those results against a large body of research. The result is an assessment of arterial hardening that is very accurate.</w:t>
       </w:r>
     </w:p>
     <w:p>
@@ -1209,7 +1209,7 @@
         <w:pStyle w:val="FirstParagraph"/>
       </w:pPr>
       <w:r>
-        <w:t xml:space="preserve">The Max Pulse will show you in just 1 minute if the recipient is suffering from arterial wall stiffness and gives you an accurate estimate of the biological age of the arteries. The simple finger clip is non-invasive and the test is very simple to administer. The Arterial Stiffness Test shows the degree of plaque buildup in the arteries and resultant arterial hardening. The test will also indicate early-stage congestive heart failure if present.</w:t>
+        <w:t xml:space="preserve">The Silvernorth Pulse HRV will show you in just 1 minute if the recipient is suffering from arterial wall stiffness and gives you an accurate estimate of the biological age of the arteries. The simple finger clip is non-invasive and the test is very simple to administer. The Arterial Stiffness Test shows the degree of plaque buildup in the arteries and resultant arterial hardening. The test will also indicate early-stage congestive heart failure if present.</w:t>
       </w:r>
     </w:p>
     <w:p>
@@ -1246,7 +1246,7 @@
         <w:pStyle w:val="FirstParagraph"/>
       </w:pPr>
       <w:r>
-        <w:t xml:space="preserve">The Max Pulse is very sensitive and it can show changes quite quickly.</w:t>
+        <w:t xml:space="preserve">The Silvernorth Pulse HRV is very sensitive and it can show changes quite quickly.</w:t>
       </w:r>
       <w:r>
         <w:br/>
@@ -1289,7 +1289,7 @@
           <w:iCs/>
           <w:i/>
         </w:rPr>
-        <w:t xml:space="preserve">Our machine tracks every heartbeat and scores it. Then the Max Pulse presents the results broken down by percentage of heartbeats. So after treatment even if the heart has just 5 or 10 heartbeats that struggle less or arteries flex a bit better, you will see it on the percentage scoring section. </w:t>
+        <w:t xml:space="preserve">Our machine tracks every heartbeat and scores it. Then the Silvernorth Pulse HRV presents the results broken down by percentage of heartbeats. So after treatment even if the heart has just 5 or 10 heartbeats that struggle less or arteries flex a bit better, you will see it on the percentage scoring section. </w:t>
       </w:r>
     </w:p>
     <w:bookmarkEnd w:id="61"/>
@@ -1328,7 +1328,7 @@
           <w:bCs/>
           <w:b/>
         </w:rPr>
-        <w:t xml:space="preserve">Max Pulse</w:t>
+        <w:t xml:space="preserve">Silvernorth Pulse HRV</w:t>
       </w:r>
       <w:r>
         <w:rPr>
@@ -1370,7 +1370,7 @@
         <w:pStyle w:val="FirstParagraph"/>
       </w:pPr>
       <w:r>
-        <w:t xml:space="preserve">Monetizing this preventative care screening can significantly increase practice revenue. Doctors who have the Max Pulse have been billing insurance for this test successfully with great reimbursement rates. There are no hidden fees or costs associated with the Max Pulse and shipping is guaranteed within 3 days of payment.</w:t>
+        <w:t xml:space="preserve">Monetizing this preventative care screening can significantly increase practice revenue. Doctors who have the Silvernorth Pulse HRV have been billing insurance for this test successfully with great reimbursement rates. There are no hidden fees or costs associated with the Silvernorth Pulse HRV and shipping is guaranteed within 3 days of payment.</w:t>
       </w:r>
     </w:p>
     <w:bookmarkEnd w:id="65"/>
@@ -1380,7 +1380,7 @@
         <w:pStyle w:val="Heading3"/>
       </w:pPr>
       <w:r>
-        <w:t xml:space="preserve">Max Pulse Science</w:t>
+        <w:t xml:space="preserve">Silvernorth Pulse HRV Science</w:t>
       </w:r>
     </w:p>
     <w:p>
@@ -1388,7 +1388,7 @@
         <w:pStyle w:val="FirstParagraph"/>
       </w:pPr>
       <w:r>
-        <w:t xml:space="preserve">Photoplethysmography has been used for a long time. A simple pulse oximeter will measure the arterial pulse wave and the deviations between young healthy arteries and very advanced CVD is actually visible right there on the pulse ox. But that is not enough for clinical use. What makes the Max Pulse different is the more complex pulse wave analysis that our proprietary algorithm performs, reformatting the arterial pulse wave graph and pulling very detailed information. Multiple peer-reviewed studies have shown this technique to be effective when compared to more traditional and time-consuming methods of detecting cardiovascular disorders. Our machine takes the arterial pulse wave and interprets it using something called Accelerated Photoplethysmography (APG) which allows us to pull very precise information from the waveform. Our website has scientific studies (see link below). Contact us and we can email you a PDF that includes a summary of the important points in these studies.</w:t>
+        <w:t xml:space="preserve">Photoplethysmography has been used for a long time. A simple pulse oximeter will measure the arterial pulse wave and the deviations between young healthy arteries and very advanced CVD is actually visible right there on the pulse ox. But that is not enough for clinical use. What makes the Silvernorth Pulse HRV different is the more complex pulse wave analysis that our proprietary algorithm performs, reformatting the arterial pulse wave graph and pulling very detailed information. Multiple peer-reviewed studies have shown this technique to be effective when compared to more traditional and time-consuming methods of detecting cardiovascular disorders. Our machine takes the arterial pulse wave and interprets it using something called Accelerated Photoplethysmography (APG) which allows us to pull very precise information from the waveform. Our website has scientific studies (see link below). Contact us and we can email you a PDF that includes a summary of the important points in these studies.</w:t>
       </w:r>
     </w:p>
     <w:bookmarkEnd w:id="66"/>
@@ -1398,7 +1398,7 @@
         <w:pStyle w:val="Heading3"/>
       </w:pPr>
       <w:r>
-        <w:t xml:space="preserve">What Comes With the Max Pulse</w:t>
+        <w:t xml:space="preserve">What Comes With the Silvernorth Pulse HRV</w:t>
       </w:r>
     </w:p>
     <w:p>
@@ -1410,7 +1410,7 @@
           <wp:inline>
             <wp:extent cx="5029200" cy="3771900"/>
             <wp:effectExtent b="0" l="0" r="0" t="0"/>
-            <wp:docPr descr="max pulse" title="" id="68" name="Picture"/>
+            <wp:docPr descr="Silvernorth Pulse HRV" title="" id="68" name="Picture"/>
             <a:graphic>
               <a:graphicData uri="http://schemas.openxmlformats.org/drawingml/2006/picture">
                 <pic:pic>
@@ -1448,7 +1448,7 @@
         </w:drawing>
       </w:r>
       <w:r>
-        <w:t xml:space="preserve">The complete package ships with everything needed to perform the testing is included in the box. There are no extra costs associated with using the Max Pulse, everything you need is provided, including:</w:t>
+        <w:t xml:space="preserve">The complete package ships with everything needed to perform the testing is included in the box. There are no extra costs associated with using the Silvernorth Pulse HRV, everything you need is provided, including:</w:t>
       </w:r>
     </w:p>
     <w:p>
@@ -1460,7 +1460,7 @@
         <w:pStyle w:val="Compact"/>
       </w:pPr>
       <w:r>
-        <w:t xml:space="preserve">The Max Pulse Device itself, (note: the Max Pulse must be connected to a computer to operate),</w:t>
+        <w:t xml:space="preserve">The Silvernorth Pulse HRV Device itself, (note: the Silvernorth Pulse HRV must be connected to a computer to operate),</w:t>
       </w:r>
     </w:p>
     <w:p>
@@ -1540,7 +1540,7 @@
         <w:pStyle w:val="FirstParagraph"/>
       </w:pPr>
       <w:r>
-        <w:t xml:space="preserve">Once the Max Pulse arrives with you, we have training videos that show you how to set up your device (which only takes a few minutes), how to perform the tests, and how to interpret the results. You can watch these anytime and use them to train personnel to administer the tests in your office. You can find these videos on this website under training videos or follow this link:  https://longlifecardio.com/max-pulse-training-videos/</w:t>
+        <w:t xml:space="preserve">Once the Silvernorth Pulse HRV arrives with you, we have training videos that show you how to set up your device (which only takes a few minutes), how to perform the tests, and how to interpret the results. You can watch these anytime and use them to train personnel to administer the tests in your office. You can find these videos on this website under training videos or follow this link:  https://longlifecardio.com/max-pulse-training-videos/</w:t>
       </w:r>
     </w:p>
     <w:bookmarkEnd w:id="70"/>
@@ -1550,7 +1550,7 @@
         <w:pStyle w:val="Heading3"/>
       </w:pPr>
       <w:r>
-        <w:t xml:space="preserve">The Max Pulse Reports</w:t>
+        <w:t xml:space="preserve">The Silvernorth Pulse HRV Reports</w:t>
       </w:r>
     </w:p>
     <w:bookmarkEnd w:id="71"/>
@@ -1560,7 +1560,7 @@
         <w:pStyle w:val="Heading3"/>
       </w:pPr>
       <w:r>
-        <w:t xml:space="preserve">The Max Pulse Arterial Stiffness Printable Report</w:t>
+        <w:t xml:space="preserve">The Silvernorth Pulse HRV Arterial Stiffness Printable Report</w:t>
       </w:r>
       <w:r>
         <w:br/>
@@ -1621,7 +1621,7 @@
         <w:pStyle w:val="BodyText"/>
       </w:pPr>
       <w:r>
-        <w:t xml:space="preserve">This is the results screen showing the final report for arterial stiffness. This example test report shows a type 1 graph, which is excellent arterial compliance (flexibility). When the machine arrives, it also comes with a manual and an interpretive guide so that you can easily interpret the results. The Max Pulse arterial stiffness report includes a very powerful feature. The report shows what percentage of heartbeats fell into each category. When the heart beats, it does so a little bit differently each and every time. So while the machine will give you an overall type from 1-7, it will also show you percentages next to each type. In this instance, notice that the patient had 60.4% of their heartbeats fall in type 1 and the rest were type 2. This shows a type 1 starting to degrade to a type 2. When you see lower scores these percentages become more and more important. For example, one person may score a type 2 result that is split between type 1 and type 2. That is good. Another person might score a type 2 result that is split between a type 2 and type 3. That is concerning and the patient should take that degradation seriously.</w:t>
+        <w:t xml:space="preserve">This is the results screen showing the final report for arterial stiffness. This example test report shows a type 1 graph, which is excellent arterial compliance (flexibility). When the machine arrives, it also comes with a manual and an interpretive guide so that you can easily interpret the results. The Silvernorth Pulse HRV arterial stiffness report includes a very powerful feature. The report shows what percentage of heartbeats fell into each category. When the heart beats, it does so a little bit differently each and every time. So while the machine will give you an overall type from 1-7, it will also show you percentages next to each type. In this instance, notice that the patient had 60.4% of their heartbeats fall in type 1 and the rest were type 2. This shows a type 1 starting to degrade to a type 2. When you see lower scores these percentages become more and more important. For example, one person may score a type 2 result that is split between type 1 and type 2. That is good. Another person might score a type 2 result that is split between a type 2 and type 3. That is concerning and the patient should take that degradation seriously.</w:t>
       </w:r>
     </w:p>
     <w:bookmarkEnd w:id="75"/>
@@ -1631,7 +1631,7 @@
         <w:pStyle w:val="Heading3"/>
       </w:pPr>
       <w:r>
-        <w:t xml:space="preserve">Max Pulse Heart Rate Variability Test Report</w:t>
+        <w:t xml:space="preserve">Silvernorth Pulse HRV Heart Rate Variability Test Report</w:t>
       </w:r>
       <w:r>
         <w:br/>
@@ -1687,7 +1687,7 @@
         <w:pStyle w:val="FirstParagraph"/>
       </w:pPr>
       <w:r>
-        <w:t xml:space="preserve">Long Life Cardio has been distributing arterial testing equipment since 2012 and we pride ourselves on excellent customer service and representing durable, high-quality equipment. We back up our Max Pulse sales with a comprehensive 1 year warranty or a 5 year extended warranty.</w:t>
+        <w:t xml:space="preserve">Long Life Cardio has been distributing arterial testing equipment since 2012 and we pride ourselves on excellent customer service and representing durable, high-quality equipment. We back up our Silvernorth Pulse HRV sales with a comprehensive 1 year warranty or a 5 year extended warranty.</w:t>
       </w:r>
     </w:p>
     <w:p>
@@ -1703,7 +1703,7 @@
         <w:pStyle w:val="BlockText"/>
       </w:pPr>
       <w:r>
-        <w:t xml:space="preserve">The Team at Long Life Cardio made the acquisition of my Max Pulse device a great experience. Wayne went above and beyond to answer my questions. I highly recommend them.” – Dr. Horton, MD</w:t>
+        <w:t xml:space="preserve">The Team at Long Life Cardio made the acquisition of my Silvernorth Pulse HRV device a great experience. Wayne went above and beyond to answer my questions. I highly recommend them.” – Dr. Horton, MD</w:t>
       </w:r>
     </w:p>
     <w:p>
@@ -1711,7 +1711,7 @@
         <w:pStyle w:val="BlockText"/>
       </w:pPr>
       <w:r>
-        <w:t xml:space="preserve">Tech Support with Long Life Cardio is easily accessible and most professional. I highly recommend Max Pulse not only for all medical offices, but especially those clinicians who focus on preventive health.” – Randy A. Birken, MD</w:t>
+        <w:t xml:space="preserve">Tech Support with Long Life Cardio is easily accessible and most professional. I highly recommend Silvernorth Pulse HRV not only for all medical offices, but especially those clinicians who focus on preventive health.” – Randy A. Birken, MD</w:t>
       </w:r>
     </w:p>
     <w:p>
@@ -1736,7 +1736,7 @@
         <w:pStyle w:val="FirstParagraph"/>
       </w:pPr>
       <w:r>
-        <w:t xml:space="preserve">The Max Pulse is an FDA 501K Approved Class II Medical Device (See Clearance Information Here).</w:t>
+        <w:t xml:space="preserve">The Silvernorth Pulse HRV is an FDA 501K Approved Class II Medical Device (See Clearance Information Here).</w:t>
       </w:r>
     </w:p>
     <w:bookmarkEnd w:id="77"/>
@@ -1746,7 +1746,7 @@
         <w:pStyle w:val="Heading4"/>
       </w:pPr>
       <w:r>
-        <w:t xml:space="preserve">Get Your Max Pulse Today!</w:t>
+        <w:t xml:space="preserve">Get Your Silvernorth Pulse HRV Today!</w:t>
       </w:r>
     </w:p>
     <w:bookmarkStart w:id="78" w:name="X3ef127b1d7843a67b12ad818f64ecfac7388dd8"/>
@@ -1767,7 +1767,7 @@
         <w:pStyle w:val="FirstParagraph"/>
       </w:pPr>
       <w:r>
-        <w:t xml:space="preserve">(Includes Max Pulse with Accessories, and Laptop with Software.</w:t>
+        <w:t xml:space="preserve">(Includes Silvernorth Pulse HRV with Accessories, and Laptop with Software.</w:t>
       </w:r>
       <w:r>
         <w:br/>
@@ -1823,7 +1823,7 @@
         <w:pStyle w:val="Heading1"/>
       </w:pPr>
       <w:r>
-        <w:t xml:space="preserve">Max Pulse FDA Clearance</w:t>
+        <w:t xml:space="preserve">Silvernorth Pulse HRV FDA Clearance</w:t>
       </w:r>
     </w:p>
     <w:bookmarkStart w:id="83" w:name="content"/>
@@ -1832,7 +1832,7 @@
         <w:pStyle w:val="FirstParagraph"/>
       </w:pPr>
       <w:r>
-        <w:t xml:space="preserve">The Max Pulse FDA 501(k) clearance was received in June of 2011, and the number is K110374.</w:t>
+        <w:t xml:space="preserve">The Silvernorth Pulse HRV FDA 501(k) clearance was received in June of 2011, and the number is K110374.</w:t>
       </w:r>
     </w:p>
     <w:p>
@@ -1848,7 +1848,7 @@
         <w:pStyle w:val="BodyText"/>
       </w:pPr>
       <w:r>
-        <w:t xml:space="preserve">The Max Pulse FDA Clearance indications for use are as follows:</w:t>
+        <w:t xml:space="preserve">The Silvernorth Pulse HRV FDA Clearance indications for use are as follows:</w:t>
       </w:r>
     </w:p>
     <w:p>
@@ -1889,7 +1889,7 @@
         <w:pStyle w:val="Heading1"/>
       </w:pPr>
       <w:r>
-        <w:t xml:space="preserve">Max Pulse Test- Usage Guide</w:t>
+        <w:t xml:space="preserve">Silvernorth Pulse HRV Test- Usage Guide</w:t>
       </w:r>
     </w:p>
     <w:bookmarkStart w:id="89" w:name="content"/>
@@ -1949,7 +1949,7 @@
         </w:drawing>
       </w:r>
       <w:r>
-        <w:t xml:space="preserve">The Max Pulse test is easy to perform and can be done in as little as one minute. Here are simple instructions that will help you to get accurate results. Click to see an overview of the Max Pulse.</w:t>
+        <w:t xml:space="preserve">The Silvernorth Pulse HRV test is easy to perform and can be done in as little as one minute. Here are simple instructions that will help you to get accurate results. Click to see an overview of the Silvernorth Pulse HRV.</w:t>
       </w:r>
     </w:p>
     <w:p>
@@ -2034,7 +2034,7 @@
         <w:pStyle w:val="Compact"/>
       </w:pPr>
       <w:r>
-        <w:t xml:space="preserve">Acrylic nails  (false nails) can block the Max Pulse sensor in some cases, especially if they are long and wont allow the sensor to be seated deeply on the finger.  In this instance retest the patient when this has been removed. Always ensure the finger clip is seated properly on the finger.</w:t>
+        <w:t xml:space="preserve">Acrylic nails  (false nails) can block the Silvernorth Pulse HRV sensor in some cases, especially if they are long and wont allow the sensor to be seated deeply on the finger.  In this instance retest the patient when this has been removed. Always ensure the finger clip is seated properly on the finger.</w:t>
       </w:r>
     </w:p>
     <w:p>
@@ -2142,7 +2142,7 @@
         <w:pStyle w:val="BodyText"/>
       </w:pPr>
       <w:r>
-        <w:t xml:space="preserve">It is very important for both practitioners and those who are performing the test to be able to see when a Max Pulse test result is invalid.</w:t>
+        <w:t xml:space="preserve">It is very important for both practitioners and those who are performing the test to be able to see when a Silvernorth Pulse HRV test result is invalid.</w:t>
       </w:r>
     </w:p>
     <w:p>
@@ -2326,7 +2326,7 @@
         <w:pStyle w:val="Heading1"/>
       </w:pPr>
       <w:r>
-        <w:t xml:space="preserve">Max Pulse Test - Detailed Reports</w:t>
+        <w:t xml:space="preserve">Silvernorth Pulse HRV Test - Detailed Reports</w:t>
       </w:r>
     </w:p>
     <w:bookmarkStart w:id="102" w:name="content"/>
@@ -2336,7 +2336,7 @@
         <w:pStyle w:val="Heading2"/>
       </w:pPr>
       <w:r>
-        <w:t xml:space="preserve">Max Pulse Test – Detailed Reports</w:t>
+        <w:t xml:space="preserve">Silvernorth Pulse HRV Test – Detailed Reports</w:t>
       </w:r>
     </w:p>
     <w:bookmarkEnd w:id="91"/>
@@ -2410,15 +2410,15 @@
         </w:drawing>
       </w:r>
       <w:r>
-        <w:t xml:space="preserve">The Max Pulse Test generates one report for arterial stiffness and another report showing patient stress levels. Max Pulse Test reports can be printed or saved to PDF.</w:t>
-      </w:r>
-    </w:p>
-    <w:p>
-      <w:pPr>
-        <w:pStyle w:val="BodyText"/>
-      </w:pPr>
-      <w:r>
-        <w:t xml:space="preserve">The following report is generated by the Max Pulse to show arterial aging.</w:t>
+        <w:t xml:space="preserve">The Silvernorth Pulse HRV Test generates one report for arterial stiffness and another report showing patient stress levels. Silvernorth Pulse HRV Test reports can be printed or saved to PDF.</w:t>
+      </w:r>
+    </w:p>
+    <w:p>
+      <w:pPr>
+        <w:pStyle w:val="BodyText"/>
+      </w:pPr>
+      <w:r>
+        <w:t xml:space="preserve">The following report is generated by the Silvernorth Pulse HRV to show arterial aging.</w:t>
       </w:r>
     </w:p>
     <w:bookmarkStart w:id="95" w:name="analysis-of-pulse-section"/>
@@ -2557,7 +2557,7 @@
         <w:pStyle w:val="Heading3"/>
       </w:pPr>
       <w:r>
-        <w:t xml:space="preserve">The Max Pulse Autonomic Balance and Stress Report</w:t>
+        <w:t xml:space="preserve">The Silvernorth Pulse HRV Autonomic Balance and Stress Report</w:t>
       </w:r>
     </w:p>
     <w:p>
@@ -2617,7 +2617,7 @@
         <w:br/>
       </w:r>
       <w:r>
-        <w:t xml:space="preserve">(The Max Pulse Test measures Heart Rate Variability and gives an analysis)</w:t>
+        <w:t xml:space="preserve">(The Silvernorth Pulse HRV Test measures Heart Rate Variability and gives an analysis)</w:t>
       </w:r>
     </w:p>
     <w:p>
@@ -2808,15 +2808,15 @@
         <w:t xml:space="preserve"> </w:t>
       </w:r>
       <w:r>
-        <w:t xml:space="preserve">Score – the last bar graph. The Max Pulse has this unique aspect of HRV where it shows stress/fatigue, but it also scores how well the person is holding up under their stress- a kind of “stress gas tank”. This is great to show people the importance of caring for themselves. People can go charging along with terrible HRV scores for quite a while and feel fine. But when the Stress Resistance (“stress gas tank”) runs out, you get sudden collapses that can be serious and take a long time to recover from. This one score is very important and can avert poor patient outcomes by giving the early warning that the person can probably feel – but is ignoring.</w:t>
-      </w:r>
-    </w:p>
-    <w:p>
-      <w:pPr>
-        <w:pStyle w:val="BodyText"/>
-      </w:pPr>
-      <w:r>
-        <w:t xml:space="preserve">Contact us for a more detailed explanation of the Heart Rate Variability report or if you have any questions about the Max Pulse Reports and how they work. There is a lot of information delivered by these reports that is not covered on this page.</w:t>
+        <w:t xml:space="preserve">Score – the last bar graph. The Silvernorth Pulse HRV has this unique aspect of HRV where it shows stress/fatigue, but it also scores how well the person is holding up under their stress- a kind of “stress gas tank”. This is great to show people the importance of caring for themselves. People can go charging along with terrible HRV scores for quite a while and feel fine. But when the Stress Resistance (“stress gas tank”) runs out, you get sudden collapses that can be serious and take a long time to recover from. This one score is very important and can avert poor patient outcomes by giving the early warning that the person can probably feel – but is ignoring.</w:t>
+      </w:r>
+    </w:p>
+    <w:p>
+      <w:pPr>
+        <w:pStyle w:val="BodyText"/>
+      </w:pPr>
+      <w:r>
+        <w:t xml:space="preserve">Contact us for a more detailed explanation of the Heart Rate Variability report or if you have any questions about the Silvernorth Pulse HRV Reports and how they work. There is a lot of information delivered by these reports that is not covered on this page.</w:t>
       </w:r>
     </w:p>
     <w:bookmarkEnd w:id="101"/>
@@ -2828,7 +2828,7 @@
         <w:pStyle w:val="Heading1"/>
       </w:pPr>
       <w:r>
-        <w:t xml:space="preserve">Max Pulse Pricing</w:t>
+        <w:t xml:space="preserve">Silvernorth Pulse HRV Pricing</w:t>
       </w:r>
     </w:p>
     <w:p>
@@ -2901,7 +2901,7 @@
           <w:bCs/>
           <w:b/>
         </w:rPr>
-        <w:t xml:space="preserve">Max Pulse with Accessories, Laptop and Software (5 Year Warranty) –</w:t>
+        <w:t xml:space="preserve">Silvernorth Pulse HRV with Accessories, Laptop and Software (5 Year Warranty) –</w:t>
       </w:r>
     </w:p>
     <w:bookmarkEnd w:id="107"/>
@@ -2965,7 +2965,7 @@
         <w:pStyle w:val="Heading3"/>
       </w:pPr>
       <w:r>
-        <w:t xml:space="preserve">Your Max Pulse Comes With…</w:t>
+        <w:t xml:space="preserve">Your Silvernorth Pulse HRV Comes With…</w:t>
       </w:r>
     </w:p>
     <w:p>
@@ -2985,7 +2985,7 @@
         <w:t xml:space="preserve"> </w:t>
       </w:r>
       <w:r>
-        <w:t xml:space="preserve">Long Life Cardio ships all Max Pulse devices in the Continental US by 2-day FedEx, fully insured. We guarantee shipping within 3 days of your payment, but shipping is normally same day or next day.</w:t>
+        <w:t xml:space="preserve">Long Life Cardio ships all Silvernorth Pulse HRV devices in the Continental US by 2-day FedEx, fully insured. We guarantee shipping within 3 days of your payment, but shipping is normally same day or next day.</w:t>
       </w:r>
     </w:p>
     <w:p>
@@ -3031,7 +3031,7 @@
         <w:pStyle w:val="Compact"/>
       </w:pPr>
       <w:r>
-        <w:t xml:space="preserve">The Max Pulse Device with 5 year warranty</w:t>
+        <w:t xml:space="preserve">The Silvernorth Pulse HRV Device with 5 year warranty</w:t>
       </w:r>
     </w:p>
     <w:p>
@@ -3091,7 +3091,7 @@
         <w:pStyle w:val="Compact"/>
       </w:pPr>
       <w:r>
-        <w:t xml:space="preserve">The Max Pulse arrives ready to use. There are no hidden costs and no on-going fees.</w:t>
+        <w:t xml:space="preserve">The Silvernorth Pulse HRV arrives ready to use. There are no hidden costs and no on-going fees.</w:t>
       </w:r>
     </w:p>
     <w:p>
@@ -3190,7 +3190,7 @@
         <w:pStyle w:val="Heading1"/>
       </w:pPr>
       <w:r>
-        <w:t xml:space="preserve">Max Pulse Value to Clinic</w:t>
+        <w:t xml:space="preserve">Silvernorth Pulse HRV Value to Clinic</w:t>
       </w:r>
     </w:p>
     <w:bookmarkStart w:id="114" w:name="content"/>
@@ -3199,7 +3199,7 @@
         <w:pStyle w:val="FirstParagraph"/>
       </w:pPr>
       <w:r>
-        <w:t xml:space="preserve">The Max Pulse device performs two functions.</w:t>
+        <w:t xml:space="preserve">The Silvernorth Pulse HRV device performs two functions.</w:t>
       </w:r>
     </w:p>
     <w:p>
@@ -3284,7 +3284,7 @@
         <w:pStyle w:val="BodyText"/>
       </w:pPr>
       <w:r>
-        <w:t xml:space="preserve">The secondary value is that the machine can show patients the value of various therapies being offered. For example you can test after the use of an innovative therapy and you will often see small bumps in the more sensitive markers that the report generates. You can validate your other treatments using the Max Pulse.</w:t>
+        <w:t xml:space="preserve">The secondary value is that the machine can show patients the value of various therapies being offered. For example you can test after the use of an innovative therapy and you will often see small bumps in the more sensitive markers that the report generates. You can validate your other treatments using the Silvernorth Pulse HRV.</w:t>
       </w:r>
     </w:p>
     <w:p>
@@ -3422,7 +3422,7 @@
         <w:pStyle w:val="Heading1"/>
       </w:pPr>
       <w:r>
-        <w:t xml:space="preserve">Max Pulse Device for GPs and Family Practices</w:t>
+        <w:t xml:space="preserve">Silvernorth Pulse HRV Device for GPs and Family Practices</w:t>
       </w:r>
     </w:p>
     <w:bookmarkStart w:id="120" w:name="content"/>
@@ -3435,7 +3435,7 @@
           <wp:inline>
             <wp:extent cx="5029200" cy="3771900"/>
             <wp:effectExtent b="0" l="0" r="0" t="0"/>
-            <wp:docPr descr="max pulse device" title="" id="117" name="Picture"/>
+            <wp:docPr descr="Silvernorth Pulse HRV device" title="" id="117" name="Picture"/>
             <a:graphic>
               <a:graphicData uri="http://schemas.openxmlformats.org/drawingml/2006/picture">
                 <pic:pic>
@@ -3571,7 +3571,7 @@
         <w:pStyle w:val="FirstParagraph"/>
       </w:pPr>
       <w:r>
-        <w:t xml:space="preserve">General Practice Physicians frequently screen for cardiovascular disease by testing lipids, blood sugar, and regular blood pressure monitoring. However, the Max Pulse is an additional screening tool for cardiovascular disease that actually offers insight into the state of atherosclerosis in a patient.</w:t>
+        <w:t xml:space="preserve">General Practice Physicians frequently screen for cardiovascular disease by testing lipids, blood sugar, and regular blood pressure monitoring. However, the Silvernorth Pulse HRV is an additional screening tool for cardiovascular disease that actually offers insight into the state of atherosclerosis in a patient.</w:t>
       </w:r>
     </w:p>
     <w:p>
@@ -3587,7 +3587,7 @@
         <w:pStyle w:val="BodyText"/>
       </w:pPr>
       <w:r>
-        <w:t xml:space="preserve">This is a good tool to use in the course of regular check-ups regardless of age since it can help identify early signs of atherosclerosis. Additionally, it should be used with patients who have a known history and/or risk of CVD and can even help track progression from visit to visit. The Max Pulse should also be used in patients with diabetes as part of their regular testing program.</w:t>
+        <w:t xml:space="preserve">This is a good tool to use in the course of regular check-ups regardless of age since it can help identify early signs of atherosclerosis. Additionally, it should be used with patients who have a known history and/or risk of CVD and can even help track progression from visit to visit. The Silvernorth Pulse HRV should also be used in patients with diabetes as part of their regular testing program.</w:t>
       </w:r>
     </w:p>
     <w:bookmarkEnd w:id="120"/>
@@ -3753,7 +3753,7 @@
           <w:bCs/>
           <w:b/>
         </w:rPr>
-        <w:t xml:space="preserve">When Using the Max Pulse In Research Studies:</w:t>
+        <w:t xml:space="preserve">When Using the Silvernorth Pulse HRV In Research Studies:</w:t>
       </w:r>
       <w:r>
         <w:t xml:space="preserve"> </w:t>
@@ -3905,7 +3905,7 @@
           <w:bCs/>
           <w:b/>
         </w:rPr>
-        <w:t xml:space="preserve">This is an example of some ideas that could be reviewed as potential recommendations for patients who fail the Max Pulse Arterial Test. This list should not be used for treatment of actual patients but patients should be given unique treatment programs as determined by qualified medical professionals. This list does not represent a complete statement of treatments possible or available. Practitioners must make their own treatment determinations. Long Life Cardio does not recommend any particular treatment program but offers this list as suggestions for a practitioner to examine. Where a patient or client fails the Max Pulse arterial test we recommend referral to a cardiologist.</w:t>
+        <w:t xml:space="preserve">This is an example of some ideas that could be reviewed as potential recommendations for patients who fail the Silvernorth Pulse HRV Arterial Test. This list should not be used for treatment of actual patients but patients should be given unique treatment programs as determined by qualified medical professionals. This list does not represent a complete statement of treatments possible or available. Practitioners must make their own treatment determinations. Long Life Cardio does not recommend any particular treatment program but offers this list as suggestions for a practitioner to examine. Where a patient or client fails the Silvernorth Pulse HRV arterial test we recommend referral to a cardiologist.</w:t>
       </w:r>
     </w:p>
     <w:bookmarkStart w:id="126" w:name="type-1-3-is-a-passing-score."/>
@@ -4886,7 +4886,7 @@
         <w:pStyle w:val="Heading4"/>
       </w:pPr>
       <w:r>
-        <w:t xml:space="preserve">Get Your Max Pulse Today!</w:t>
+        <w:t xml:space="preserve">Get Your Silvernorth Pulse HRV Today!</w:t>
       </w:r>
     </w:p>
     <w:bookmarkStart w:id="152" w:name="Xc7c69b04852120460b865ad49d5c2e18a91d8d0"/>
@@ -4907,7 +4907,7 @@
         <w:pStyle w:val="FirstParagraph"/>
       </w:pPr>
       <w:r>
-        <w:t xml:space="preserve">(Includes Max Pulse</w:t>
+        <w:t xml:space="preserve">(Includes Silvernorth Pulse HRV</w:t>
       </w:r>
       <w:r>
         <w:rPr>
@@ -5820,7 +5820,7 @@
         <w:pStyle w:val="Heading4"/>
       </w:pPr>
       <w:r>
-        <w:t xml:space="preserve">Get Your Max Pulse Today!</w:t>
+        <w:t xml:space="preserve">Get Your Silvernorth Pulse HRV Today!</w:t>
       </w:r>
     </w:p>
     <w:bookmarkStart w:id="154" w:name="X39be822f07e3ff9c2749175740dd6b402f51110"/>
@@ -5841,7 +5841,7 @@
         <w:pStyle w:val="FirstParagraph"/>
       </w:pPr>
       <w:r>
-        <w:t xml:space="preserve">(Includes Max Pulse</w:t>
+        <w:t xml:space="preserve">(Includes Silvernorth Pulse HRV</w:t>
       </w:r>
       <w:r>
         <w:rPr>
@@ -5995,7 +5995,7 @@
         <w:t xml:space="preserve"> </w:t>
       </w:r>
       <w:r>
-        <w:t xml:space="preserve">HRV serves as an indicator of overall cardiovascular health and autonomic balance. A higher HRV is generally associated with better health outcomes, while lower HRV can signify stress, fatigue, or potential health issues. This is the main use for the Max Pulse device stress test and is especially helpful in functional medicine settings where predictors of patient health are used to take action proactively, treating a patient before they have adrenal fatigue, a cardio event or other stress induced illness.</w:t>
+        <w:t xml:space="preserve">HRV serves as an indicator of overall cardiovascular health and autonomic balance. A higher HRV is generally associated with better health outcomes, while lower HRV can signify stress, fatigue, or potential health issues. This is the main use for the Silvernorth Pulse HRV device stress test and is especially helpful in functional medicine settings where predictors of patient health are used to take action proactively, treating a patient before they have adrenal fatigue, a cardio event or other stress induced illness.</w:t>
       </w:r>
     </w:p>
     <w:p>
@@ -6013,7 +6013,7 @@
         <w:t xml:space="preserve"> </w:t>
       </w:r>
       <w:r>
-        <w:t xml:space="preserve">HRV testing or scoring gives understanding of an individual’s stress response mechanisms. Studies show a correlation between HRV and psychological and physical resilience, offering insights into the adaptability of individuals under stress.  Stress Resistance is the last bar graph on the Max Pulse Stress Report but it is one of the most important, showing how close a patient is to overwhelming their reserves and thus opening the door to a health breakdown.</w:t>
+        <w:t xml:space="preserve">HRV testing or scoring gives understanding of an individual’s stress response mechanisms. Studies show a correlation between HRV and psychological and physical resilience, offering insights into the adaptability of individuals under stress.  Stress Resistance is the last bar graph on the Silvernorth Pulse HRV Stress Report but it is one of the most important, showing how close a patient is to overwhelming their reserves and thus opening the door to a health breakdown.</w:t>
       </w:r>
     </w:p>
     <w:p>
@@ -6084,7 +6084,7 @@
         <w:pStyle w:val="BodyText"/>
       </w:pPr>
       <w:r>
-        <w:t xml:space="preserve">The Max Pulse uses both of these methods to generate scores for its Stress Report.</w:t>
+        <w:t xml:space="preserve">The Silvernorth Pulse HRV uses both of these methods to generate scores for its Stress Report.</w:t>
       </w:r>
     </w:p>
     <w:p>
@@ -6510,7 +6510,7 @@
         <w:pStyle w:val="BodyText"/>
       </w:pPr>
       <w:r>
-        <w:t xml:space="preserve">The Max Pulse is an easy, non-invasive way to to test Heart Rate Variability. It only takes a few minutes.</w:t>
+        <w:t xml:space="preserve">The Silvernorth Pulse HRV is an easy, non-invasive way to to test Heart Rate Variability. It only takes a few minutes.</w:t>
       </w:r>
     </w:p>
     <w:p>
@@ -6588,15 +6588,15 @@
         <w:pStyle w:val="BodyText"/>
       </w:pPr>
       <w:r>
-        <w:t xml:space="preserve">Blood pressure and blood may both be normal but someone can still be at risk and not be aware. The Max Pulse is a quick, non-invasive, and inexpensive way to get a better “snapshot” as to what might be going on in the arteries and can be included in a regular check-up. Additionally, it is an effective tool in diabetes management and for use on anyone else who is at increased risk of cardiovascular disease.</w:t>
-      </w:r>
-    </w:p>
-    <w:p>
-      <w:pPr>
-        <w:pStyle w:val="BodyText"/>
-      </w:pPr>
-      <w:r>
-        <w:t xml:space="preserve">The Max Pulse measures blood at the fingertip, but it graphs the heart beat as it moves through both systolic and diastolic pressures. The more flexible the arteries are, the more deviations will show on the graph. If the graph is tight and more regular, it can be an indication that the arteries are stiff. This device also looks at circulation results for large and small arteries. If the test indicates that the larger arteries are constricting and appear to be hardened, then this is a red flag and further testing would be indicated.</w:t>
+        <w:t xml:space="preserve">Blood pressure and blood may both be normal but someone can still be at risk and not be aware. The Silvernorth Pulse HRV is a quick, non-invasive, and inexpensive way to get a better “snapshot” as to what might be going on in the arteries and can be included in a regular check-up. Additionally, it is an effective tool in diabetes management and for use on anyone else who is at increased risk of cardiovascular disease.</w:t>
+      </w:r>
+    </w:p>
+    <w:p>
+      <w:pPr>
+        <w:pStyle w:val="BodyText"/>
+      </w:pPr>
+      <w:r>
+        <w:t xml:space="preserve">The Silvernorth Pulse HRV measures blood at the fingertip, but it graphs the heart beat as it moves through both systolic and diastolic pressures. The more flexible the arteries are, the more deviations will show on the graph. If the graph is tight and more regular, it can be an indication that the arteries are stiff. This device also looks at circulation results for large and small arteries. If the test indicates that the larger arteries are constricting and appear to be hardened, then this is a red flag and further testing would be indicated.</w:t>
       </w:r>
     </w:p>
     <w:p>
@@ -6704,7 +6704,7 @@
         <w:pStyle w:val="FirstParagraph"/>
       </w:pPr>
       <w:r>
-        <w:t xml:space="preserve">With cardiovascular death being the number one killer in America, it is important to monitor and detect risks so that prevention tactics can be implemented as soon as possible. The Max Pulse is a helpful tool for this kind of screening as it is easy to use, quick and noninvasive.</w:t>
+        <w:t xml:space="preserve">With cardiovascular death being the number one killer in America, it is important to monitor and detect risks so that prevention tactics can be implemented as soon as possible. The Silvernorth Pulse HRV is a helpful tool for this kind of screening as it is easy to use, quick and noninvasive.</w:t>
       </w:r>
     </w:p>
     <w:p>
@@ -6859,7 +6859,7 @@
         <w:pStyle w:val="BodyText"/>
       </w:pPr>
       <w:r>
-        <w:t xml:space="preserve">CVD is still the biggest killer in the US and worldwide and is directly linked to lifestyle. The problem is that once the problem is bad enough to be diagnosed, the lifestyle problems are thoroughly ingrained. Breaking that chain is vital to cracking this problem. This means it has never been more important than now to have a quick and easy screening tool to catch CVD in its early stages. Such devices have the added benefit that they prompt patients to make lifestyle changes before such changes become too difficult. The longer a person keeps going being overweight and under-exercising the harder the path back to health is. For many people, the impetus to change comes too late and they simply cannot make the journey. Long Life Cardio is proud to be the supplier of two devices that provide this life-saving service. Learn more about the Max Pulse here.</w:t>
+        <w:t xml:space="preserve">CVD is still the biggest killer in the US and worldwide and is directly linked to lifestyle. The problem is that once the problem is bad enough to be diagnosed, the lifestyle problems are thoroughly ingrained. Breaking that chain is vital to cracking this problem. This means it has never been more important than now to have a quick and easy screening tool to catch CVD in its early stages. Such devices have the added benefit that they prompt patients to make lifestyle changes before such changes become too difficult. The longer a person keeps going being overweight and under-exercising the harder the path back to health is. For many people, the impetus to change comes too late and they simply cannot make the journey. Long Life Cardio is proud to be the supplier of two devices that provide this life-saving service. Learn more about the Silvernorth Pulse HRV here.</w:t>
       </w:r>
     </w:p>
     <w:p>
@@ -7062,7 +7062,7 @@
           <w:bCs/>
           <w:b/>
         </w:rPr>
-        <w:t xml:space="preserve">The Max Pulse Screening Device</w:t>
+        <w:t xml:space="preserve">The Silvernorth Pulse HRV Screening Device</w:t>
       </w:r>
     </w:p>
     <w:p>
@@ -7074,7 +7074,7 @@
           <wp:inline>
             <wp:extent cx="5029200" cy="2704381"/>
             <wp:effectExtent b="0" l="0" r="0" t="0"/>
-            <wp:docPr descr="max pulse" title="" id="196" name="Picture"/>
+            <wp:docPr descr="Silvernorth Pulse HRV" title="" id="196" name="Picture"/>
             <a:graphic>
               <a:graphicData uri="http://schemas.openxmlformats.org/drawingml/2006/picture">
                 <pic:pic>
@@ -7112,15 +7112,15 @@
         </w:drawing>
       </w:r>
       <w:r>
-        <w:t xml:space="preserve">The Max Pulse device is an excellent tool for helping family and general practice physicians and health and wellness providers to detect early signs of cardiovascular disease. It uses a complex analysis of the patient’s arterial pulse wave to determine arterial stiffness, circulation blockage, and stress levels in the body. It is non-invasive and only takes 3-minutes to complete the test which also makes it a convenient diagnostic tool for both patients and providers.</w:t>
-      </w:r>
-    </w:p>
-    <w:p>
-      <w:pPr>
-        <w:pStyle w:val="BodyText"/>
-      </w:pPr>
-      <w:r>
-        <w:t xml:space="preserve">The Max Pulse shows accurate assessment of arterial hardening, and an indication of whether circulation is inhibited. There is a separate result for large arteries, small arteries, and capillaries. This information is very valuable to a practitioner. Larger arterial constriction and arterial hardening at the same time is of course, a huge cause of concern.</w:t>
+        <w:t xml:space="preserve">The Silvernorth Pulse HRV device is an excellent tool for helping family and general practice physicians and health and wellness providers to detect early signs of cardiovascular disease. It uses a complex analysis of the patient’s arterial pulse wave to determine arterial stiffness, circulation blockage, and stress levels in the body. It is non-invasive and only takes 3-minutes to complete the test which also makes it a convenient diagnostic tool for both patients and providers.</w:t>
+      </w:r>
+    </w:p>
+    <w:p>
+      <w:pPr>
+        <w:pStyle w:val="BodyText"/>
+      </w:pPr>
+      <w:r>
+        <w:t xml:space="preserve">The Silvernorth Pulse HRV shows accurate assessment of arterial hardening, and an indication of whether circulation is inhibited. There is a separate result for large arteries, small arteries, and capillaries. This information is very valuable to a practitioner. Larger arterial constriction and arterial hardening at the same time is of course, a huge cause of concern.</w:t>
       </w:r>
     </w:p>
     <w:p>
@@ -7136,7 +7136,7 @@
         <w:pStyle w:val="BodyText"/>
       </w:pPr>
       <w:r>
-        <w:t xml:space="preserve">For more detailed information about the Max Pulse, please visit us at our website and learn how the Max Pulse can help your patients. Our representatives will be happy to discuss our device with you. We can answer all of your questions and show you the incredible benefits this device can have for your practice.</w:t>
+        <w:t xml:space="preserve">For more detailed information about the Silvernorth Pulse HRV, please visit us at our website and learn how the Silvernorth Pulse HRV can help your patients. Our representatives will be happy to discuss our device with you. We can answer all of your questions and show you the incredible benefits this device can have for your practice.</w:t>
       </w:r>
     </w:p>
     <w:bookmarkEnd w:id="198"/>
@@ -7282,7 +7282,7 @@
           <w:bCs/>
           <w:b/>
         </w:rPr>
-        <w:t xml:space="preserve">Video -Max Pulse Review from Dr Steven Bednarczyk DO</w:t>
+        <w:t xml:space="preserve">Video -Silvernorth Pulse HRV Review from Dr Steven Bednarczyk DO</w:t>
       </w:r>
     </w:p>
     <w:p>
@@ -7303,7 +7303,7 @@
           <w:bCs/>
           <w:b/>
         </w:rPr>
-        <w:t xml:space="preserve">“The Max Pulse device offers a simple, quick, and highly informative test for endothelial function as well as vessel integrity.  This allows the clinician to identify patients at risk for cardiovascular disease allowing for appropriate counseling regarding lifestyle, diet, and supplemental changes as well as referral to a cardiologist if indicated.  Also, patients appear more motivated to become proactive when discussing these test results.</w:t>
+        <w:t xml:space="preserve">“The Silvernorth Pulse HRV device offers a simple, quick, and highly informative test for endothelial function as well as vessel integrity.  This allows the clinician to identify patients at risk for cardiovascular disease allowing for appropriate counseling regarding lifestyle, diet, and supplemental changes as well as referral to a cardiologist if indicated.  Also, patients appear more motivated to become proactive when discussing these test results.</w:t>
       </w:r>
     </w:p>
     <w:p>
@@ -7317,7 +7317,7 @@
           <w:bCs/>
           <w:b/>
         </w:rPr>
-        <w:t xml:space="preserve">Wayne Baumgarten with Long Life Cardio is easily assessable and most professional.I highly recommend Max Pulse not only for all medical offices, but especially those clinicians who focus on preventive health.”</w:t>
+        <w:t xml:space="preserve">Wayne Baumgarten with Long Life Cardio is easily assessable and most professional.I highly recommend Silvernorth Pulse HRV not only for all medical offices, but especially those clinicians who focus on preventive health.”</w:t>
       </w:r>
     </w:p>
     <w:p>
@@ -7453,7 +7453,7 @@
           <w:bCs/>
           <w:b/>
         </w:rPr>
-        <w:t xml:space="preserve">The Max Pulse is a true game changer. It is an excellent screening tool for assessing the endothelial function of the vessel wall in addition to providing information on ANS balance.  When a positive test for advanced arteriosclerosis is obtained, a carotid duplex with CIMT is performed in the clinic and a stress test is performed on the patient. This process led a few patients receiving cardiac catherization or carotid stenting due to the severity of their atherosclerosis.  As a Doctor of Osteopathic medicine, I find the ANS report created by the Max Pulse to be of value as well. I use the device before and after manipulation to show the patients changes in their ANS balance. The Max Pulse is a great device for any office.</w:t>
+        <w:t xml:space="preserve">The Silvernorth Pulse HRV is a true game changer. It is an excellent screening tool for assessing the endothelial function of the vessel wall in addition to providing information on ANS balance.  When a positive test for advanced arteriosclerosis is obtained, a carotid duplex with CIMT is performed in the clinic and a stress test is performed on the patient. This process led a few patients receiving cardiac catherization or carotid stenting due to the severity of their atherosclerosis.  As a Doctor of Osteopathic medicine, I find the ANS report created by the Silvernorth Pulse HRV to be of value as well. I use the device before and after manipulation to show the patients changes in their ANS balance. The Silvernorth Pulse HRV is a great device for any office.</w:t>
       </w:r>
     </w:p>
     <w:p>
@@ -7498,7 +7498,7 @@
           <w:iCs/>
           <w:i/>
         </w:rPr>
-        <w:t xml:space="preserve">The Max Pulse has become such an integral part of our Cardiovascular Preventive Service line. We have discovered several irregularities already and have been able to help facilitate patient care in the best way possible. This has been an excellent investment, but more importantly, it is such a good feeling to be able to provide this testing for my patients and their families. We give Long Life Cardio and the Max Pulse system our highest recommendation.</w:t>
+        <w:t xml:space="preserve">The Silvernorth Pulse HRV has become such an integral part of our Cardiovascular Preventive Service line. We have discovered several irregularities already and have been able to help facilitate patient care in the best way possible. This has been an excellent investment, but more importantly, it is such a good feeling to be able to provide this testing for my patients and their families. We give Long Life Cardio and the Silvernorth Pulse HRV system our highest recommendation.</w:t>
       </w:r>
     </w:p>
     <w:p>
@@ -7526,7 +7526,7 @@
           <w:iCs/>
           <w:i/>
         </w:rPr>
-        <w:t xml:space="preserve">I am an internist in Newburyport, MA seeing over 120 to 140 patients weekly. I cannot overstate the value of using the Max Pulse. Every patient over 50 is screened for cardiovascular prevention. The analysis print out is easy to understand based on measurable parameters of arterial elasticity, arterial contraction, and residual blood. The patients understand the relationship to arterial health and get the importance of follow-up testing to see if our treatments document substantial improvement. Secondly we use the heart rate variability testing to assess autonomic nervous system health. For example, we want to know if someone is stuck in sympathetic dominance. We want to know if the patient is highly stressed and has no residual reserve. We document improvements in stress, endurance, mental health, and digestion using the HRV analysis as well as by symptom management.</w:t>
+        <w:t xml:space="preserve">I am an internist in Newburyport, MA seeing over 120 to 140 patients weekly. I cannot overstate the value of using the Silvernorth Pulse HRV. Every patient over 50 is screened for cardiovascular prevention. The analysis print out is easy to understand based on measurable parameters of arterial elasticity, arterial contraction, and residual blood. The patients understand the relationship to arterial health and get the importance of follow-up testing to see if our treatments document substantial improvement. Secondly we use the heart rate variability testing to assess autonomic nervous system health. For example, we want to know if someone is stuck in sympathetic dominance. We want to know if the patient is highly stressed and has no residual reserve. We document improvements in stress, endurance, mental health, and digestion using the HRV analysis as well as by symptom management.</w:t>
       </w:r>
     </w:p>
     <w:p>
@@ -7540,7 +7540,7 @@
           <w:iCs/>
           <w:i/>
         </w:rPr>
-        <w:t xml:space="preserve">Our goal at our clinic is to prevent cardiovascular problems. Knowing that the arteries have excellent elasticity and contraction gives me reassurance that we are doing more than what is required by the standard of care. I cannot imagine working without the Max Pulse at our clinic.</w:t>
+        <w:t xml:space="preserve">Our goal at our clinic is to prevent cardiovascular problems. Knowing that the arteries have excellent elasticity and contraction gives me reassurance that we are doing more than what is required by the standard of care. I cannot imagine working without the Silvernorth Pulse HRV at our clinic.</w:t>
       </w:r>
     </w:p>
     <w:p>
@@ -7576,7 +7576,7 @@
           <w:bCs/>
           <w:b/>
         </w:rPr>
-        <w:t xml:space="preserve">I now offer this test routinely to new patients. If the patient tests well they are obviously happy. If the Max Pulse detects signs of cardiovascular disease I have tools to help that patient reverse this trend. And, in the occasional case where the Max Pulse detected serious changes I convinced the patients to obtain a consult with a Cardiologist for further evaluation.  For myself, I feel this allows me to add one more dimension to my care of my patients by offering reliable way to screen for problems developing the the patients’s CV system… one that they do not get from their PCP. I find this has engendered a good deal of good will in my patients, brought in many patients to my office, friends and relatives of patients who have gone through this screening and been referred in to the office just for the testing and often then staying with my office to manage their health. I have had patients refer their friends from as far as 2 1/2 hours away to come to get tested.</w:t>
+        <w:t xml:space="preserve">I now offer this test routinely to new patients. If the patient tests well they are obviously happy. If the Silvernorth Pulse HRV detects signs of cardiovascular disease I have tools to help that patient reverse this trend. And, in the occasional case where the Silvernorth Pulse HRV detected serious changes I convinced the patients to obtain a consult with a Cardiologist for further evaluation.  For myself, I feel this allows me to add one more dimension to my care of my patients by offering reliable way to screen for problems developing the the patients’s CV system… one that they do not get from their PCP. I find this has engendered a good deal of good will in my patients, brought in many patients to my office, friends and relatives of patients who have gone through this screening and been referred in to the office just for the testing and often then staying with my office to manage their health. I have had patients refer their friends from as far as 2 1/2 hours away to come to get tested.</w:t>
       </w:r>
     </w:p>
     <w:p>
@@ -7590,7 +7590,7 @@
           <w:bCs/>
           <w:b/>
         </w:rPr>
-        <w:t xml:space="preserve">The Max Pulse is easy to use, has a graphic readout of results that is easy for the patient to understand and is impactful for the patients to have in their hands. Many of the patients who have detected problems have decided to let us help them improve their results and with the Max Pulse we can re-test them to verify that through the treatment they are indeed improving demonstrably. For any doctor who wishes to add a dimension of cardiovascular health testing and treatment to the services they offer I cannot recommend any better investment than this excellent diagnostic device for their practice. The testing does not take long and while I do it personally, it would be equally possible for staff to be trained.</w:t>
+        <w:t xml:space="preserve">The Silvernorth Pulse HRV is easy to use, has a graphic readout of results that is easy for the patient to understand and is impactful for the patients to have in their hands. Many of the patients who have detected problems have decided to let us help them improve their results and with the Silvernorth Pulse HRV we can re-test them to verify that through the treatment they are indeed improving demonstrably. For any doctor who wishes to add a dimension of cardiovascular health testing and treatment to the services they offer I cannot recommend any better investment than this excellent diagnostic device for their practice. The testing does not take long and while I do it personally, it would be equally possible for staff to be trained.</w:t>
       </w:r>
     </w:p>
     <w:p>
@@ -7612,7 +7612,7 @@
           <w:iCs/>
           <w:i/>
         </w:rPr>
-        <w:t xml:space="preserve">I have had the Max Pulse machine for 8 years but now with the new update I am so happy to now be abl</w:t>
+        <w:t xml:space="preserve">I have had the Silvernorth Pulse HRV machine for 8 years but now with the new update I am so happy to now be abl</w:t>
       </w:r>
       <w:r>
         <w:rPr>
@@ -7621,7 +7621,7 @@
           <w:iCs/>
           <w:i/>
         </w:rPr>
-        <w:t xml:space="preserve">e to offer this test routinely to all my patients. At my clinic I try to focus on preventive health and I am glad to have the Max Pulse to motivate my patients to become more proactive when discussing these test results. It is portable and easy for me to do events with because the Max Pulse is so easy to use. It has a graphic readout of results that is easy for the patients to understand and they can take a copy home with them right away.</w:t>
+        <w:t xml:space="preserve">e to offer this test routinely to all my patients. At my clinic I try to focus on preventive health and I am glad to have the Silvernorth Pulse HRV to motivate my patients to become more proactive when discussing these test results. It is portable and easy for me to do events with because the Silvernorth Pulse HRV is so easy to use. It has a graphic readout of results that is easy for the patients to understand and they can take a copy home with them right away.</w:t>
       </w:r>
     </w:p>
     <w:p>
@@ -7643,7 +7643,7 @@
           <w:iCs/>
           <w:i/>
         </w:rPr>
-        <w:t xml:space="preserve">The MaxPulse is an easy to use and easy to integrate program that is both easily understood by patients and easily interpreted by doctors. It’s just easy on everyone. People are becoming more acutely interested in their health and well being before they are diagnosed with a condition, especially since the coronavirus pandemic. The MaxPulse gives me the opportunity to provide a real time look at a patient’s current arterial and autonomic health, and allows us to start down the path to better health before entering a state of disease. Additionally, Wayne Baumgarten was incredibly helpful and attentive in getting me set up with the software, execution of the screening, and interpretation of the data. Thankful to have a support person that handled the situation so quickly and professionally. </w:t>
+        <w:t xml:space="preserve">The Silvernorth Pulse HRV is an easy to use and easy to integrate program that is both easily understood by patients and easily interpreted by doctors. It’s just easy on everyone. People are becoming more acutely interested in their health and well being before they are diagnosed with a condition, especially since the coronavirus pandemic. The Silvernorth Pulse HRV gives me the opportunity to provide a real time look at a patient’s current arterial and autonomic health, and allows us to start down the path to better health before entering a state of disease. Additionally, Wayne Baumgarten was incredibly helpful and attentive in getting me set up with the software, execution of the screening, and interpretation of the data. Thankful to have a support person that handled the situation so quickly and professionally. </w:t>
       </w:r>
     </w:p>
     <w:p>
@@ -7689,7 +7689,7 @@
           <w:iCs/>
           <w:i/>
         </w:rPr>
-        <w:t xml:space="preserve">About 5 years ago I mentioned to my husband that I was interested in getting a heart scanning device. There were two I was trying to decide between. One took about 15 mins. to perform, while the Max Pulse scan took only 3 mins. Needless to say in a busy practice I was looking for a lot of info in a short amount of time. I absolutely love my Max Pulse! I use it with every patient. My patients really pay attention to their results and I am able to discuss both lifestyle and nutrition support for them using the easy to explain results. Patients also love to see the progress they make during follow-up scans. Max Pulse is one of the best practice tools I’ve purchased. I have had no problems with the software or the Max Pulse hardware in the 5 plus years I have owned it. From HRV, to artifacts, to atrial elasticity, to the SNS &amp; PNS activity, the patients are fully engaged in that conversation every time. It really supports compliance and follow through also. I love my Max Pulse, thank you Long Life Cardio for an excellent product.</w:t>
+        <w:t xml:space="preserve">About 5 years ago I mentioned to my husband that I was interested in getting a heart scanning device. There were two I was trying to decide between. One took about 15 mins. to perform, while the Silvernorth Pulse HRV scan took only 3 mins. Needless to say in a busy practice I was looking for a lot of info in a short amount of time. I absolutely love my Silvernorth Pulse HRV! I use it with every patient. My patients really pay attention to their results and I am able to discuss both lifestyle and nutrition support for them using the easy to explain results. Patients also love to see the progress they make during follow-up scans. Silvernorth Pulse HRV is one of the best practice tools I’ve purchased. I have had no problems with the software or the Silvernorth Pulse HRV hardware in the 5 plus years I have owned it. From HRV, to artifacts, to atrial elasticity, to the SNS &amp; PNS activity, the patients are fully engaged in that conversation every time. It really supports compliance and follow through also. I love my Silvernorth Pulse HRV, thank you Long Life Cardio for an excellent product.</w:t>
       </w:r>
     </w:p>
     <w:p>
@@ -7765,7 +7765,7 @@
           <w:bCs/>
           <w:b/>
         </w:rPr>
-        <w:t xml:space="preserve">To understand the scientific foundation of the Max Pulse, please read this article-</w:t>
+        <w:t xml:space="preserve">To understand the scientific foundation of the Silvernorth Pulse HRV, please read this article-</w:t>
       </w:r>
     </w:p>
     <w:p>
@@ -7800,7 +7800,7 @@
           <w:bCs/>
           <w:b/>
         </w:rPr>
-        <w:t xml:space="preserve">To see a peer reviewed research study using an earlier version of the Max Pulse (called the Meridian DPA) please read this study 2015-Digital Photoplethysmography for</w:t>
+        <w:t xml:space="preserve">To see a peer reviewed research study using an earlier version of the Silvernorth Pulse HRV (called the Meridian DPA) please read this study 2015-Digital Photoplethysmography for</w:t>
       </w:r>
       <w:r>
         <w:br/>
@@ -8081,15 +8081,15 @@
         </w:drawing>
       </w:r>
       <w:r>
-        <w:t xml:space="preserve">The VasoScan device is a version of the Max Pulse. The VasoScan is licensed to use the exact same ground-breaking algorithms and hardware package as the Max Pulse and delivers the exact same arterial health score and ANS stress scoring as the Max Pulse device.</w:t>
-      </w:r>
-    </w:p>
-    <w:p>
-      <w:pPr>
-        <w:pStyle w:val="BodyText"/>
-      </w:pPr>
-      <w:r>
-        <w:t xml:space="preserve">The difference between the Vasoscan and the Max Pulse is that the Max Pulse uses a more advanced version of the software, including features such as separate reports for the Arterial and ANS tests and the ability to perform a 1 minute arterial test (rather than the 3 minute minimum test time for the Vasoscan).  You will see some changes in the software which are covered in the Reports Section below.</w:t>
+        <w:t xml:space="preserve">The VasoScan device is a version of the Silvernorth Pulse HRV. The VasoScan is licensed to use the exact same ground-breaking algorithms and hardware package as the Silvernorth Pulse HRV and delivers the exact same arterial health score and ANS stress scoring as the Silvernorth Pulse HRV device.</w:t>
+      </w:r>
+    </w:p>
+    <w:p>
+      <w:pPr>
+        <w:pStyle w:val="BodyText"/>
+      </w:pPr>
+      <w:r>
+        <w:t xml:space="preserve">The difference between the Vasoscan and the Silvernorth Pulse HRV is that the Silvernorth Pulse HRV uses a more advanced version of the software, including features such as separate reports for the Arterial and ANS tests and the ability to perform a 1 minute arterial test (rather than the 3 minute minimum test time for the Vasoscan).  You will see some changes in the software which are covered in the Reports Section below.</w:t>
       </w:r>
     </w:p>
     <w:bookmarkStart w:id="218" w:name="vasoscan-customer-support"/>
@@ -8110,7 +8110,7 @@
         <w:pStyle w:val="FirstParagraph"/>
       </w:pPr>
       <w:r>
-        <w:t xml:space="preserve">Long Life Cardio in Austin Texas can offer you support for your Vasoscan device. The finger probe and all connecting cords are available for shipping if you should need replacements. If you are having problems with your Vasoscan software, you can contact us about upgrading to the Max Pulse version of the software. The Vasoscan box will run the latest version of the Max Pulse software. Please be aware that there is a fee for the software. You can contact us here to get more information and support for your device- Contact Us</w:t>
+        <w:t xml:space="preserve">Long Life Cardio in Austin Texas can offer you support for your Vasoscan device. The finger probe and all connecting cords are available for shipping if you should need replacements. If you are having problems with your Vasoscan software, you can contact us about upgrading to the Silvernorth Pulse HRV version of the software. The Vasoscan box will run the latest version of the Silvernorth Pulse HRV software. Please be aware that there is a fee for the software. You can contact us here to get more information and support for your device- Contact Us</w:t>
       </w:r>
     </w:p>
     <w:bookmarkEnd w:id="218"/>
@@ -8132,7 +8132,7 @@
         <w:pStyle w:val="FirstParagraph"/>
       </w:pPr>
       <w:r>
-        <w:t xml:space="preserve">The Vascoscan runs a 3 minute test and presents the arterial test (accelerated photoplethysmograph) and the stress test (heart rate variability) in the same report. This was also the original way that the Max Pulse presented the information.   The new software now breaks this into 2 separate reports – one for the arterial scoring and another report for the stress scores – which includes a more detailed stress scoring. If you upgrade to the latest version of the Max Pulse software you will get reports that look this this – Max Pulse Reports</w:t>
+        <w:t xml:space="preserve">The Vascoscan runs a 3 minute test and presents the arterial test (accelerated photoplethysmograph) and the stress test (heart rate variability) in the same report. This was also the original way that the Silvernorth Pulse HRV presented the information.   The new software now breaks this into 2 separate reports – one for the arterial scoring and another report for the stress scores – which includes a more detailed stress scoring. If you upgrade to the latest version of the Silvernorth Pulse HRV software you will get reports that look this this – Silvernorth Pulse HRV Reports</w:t>
       </w:r>
     </w:p>
     <w:bookmarkEnd w:id="219"/>
@@ -8176,7 +8176,7 @@
         <w:pStyle w:val="FirstParagraph"/>
       </w:pPr>
       <w:r>
-        <w:t xml:space="preserve">You can buy a Max Pulse device, which is the updated equivalent of the Vasoscan. Contact us for more information and to learn about our purchase and leasing options.</w:t>
+        <w:t xml:space="preserve">You can buy a Silvernorth Pulse HRV device, which is the updated equivalent of the Vasoscan. Contact us for more information and to learn about our purchase and leasing options.</w:t>
       </w:r>
     </w:p>
     <w:bookmarkEnd w:id="221"/>
@@ -8222,7 +8222,7 @@
         <w:t xml:space="preserve"> </w:t>
       </w:r>
       <w:r>
-        <w:t xml:space="preserve">tracks the development of this technology all the way up to the use of the Accelerated Graph as used by the Max Pulse. It lists 85 supporting references.</w:t>
+        <w:t xml:space="preserve">tracks the development of this technology all the way up to the use of the Accelerated Graph as used by the Silvernorth Pulse HRV. It lists 85 supporting references.</w:t>
       </w:r>
     </w:p>
     <w:p>
@@ -8264,7 +8264,7 @@
         <w:pStyle w:val="Heading1"/>
       </w:pPr>
       <w:r>
-        <w:t xml:space="preserve">Max Pulse Training Videos</w:t>
+        <w:t xml:space="preserve">Silvernorth Pulse HRV Training Videos</w:t>
       </w:r>
     </w:p>
     <w:bookmarkStart w:id="228" w:name="content"/>
@@ -8274,7 +8274,7 @@
         <w:pStyle w:val="Heading2"/>
       </w:pPr>
       <w:r>
-        <w:t xml:space="preserve">Protected: Max Pulse Training Videos</w:t>
+        <w:t xml:space="preserve">Protected: Silvernorth Pulse HRV Training Videos</w:t>
       </w:r>
     </w:p>
     <w:bookmarkEnd w:id="227"/>
@@ -8286,7 +8286,7 @@
         <w:pStyle w:val="Heading1"/>
       </w:pPr>
       <w:r>
-        <w:t xml:space="preserve">Max Pulse Support</w:t>
+        <w:t xml:space="preserve">Silvernorth Pulse HRV Support</w:t>
       </w:r>
     </w:p>
     <w:p>
@@ -8326,7 +8326,7 @@
         <w:pStyle w:val="Compact"/>
       </w:pPr>
       <w:r>
-        <w:t xml:space="preserve">Make sure the Max Pulse is turned on and connected to the laptop or computer. (There will be a green light inside the power button if the Max Pulse has power)</w:t>
+        <w:t xml:space="preserve">Make sure the Silvernorth Pulse HRV is turned on and connected to the laptop or computer. (There will be a green light inside the power button if the Silvernorth Pulse HRV has power)</w:t>
       </w:r>
     </w:p>
     <w:p>
@@ -8476,7 +8476,7 @@
         <w:pStyle w:val="BodyText"/>
       </w:pPr>
       <w:r>
-        <w:t xml:space="preserve">For older software versions: When you install the Max Pulse in your PC, you will have the Max Pulse_General folder generated automatically. When you perform tests, all of data will be automatically saved in this folder.</w:t>
+        <w:t xml:space="preserve">For older software versions: When you install the Silvernorth Pulse HRV in your PC, you will have the Silvernorth Pulse HRV_General folder generated automatically. When you perform tests, all of data will be automatically saved in this folder.</w:t>
       </w:r>
     </w:p>
     <w:p>
@@ -8514,7 +8514,7 @@
         <w:pStyle w:val="BodyText"/>
       </w:pPr>
       <w:r>
-        <w:t xml:space="preserve">Very important- if you are upgrading from very old software  (for example 1.0.0.3 series software) to the latest version, it is possible your patient database will not transfer. If in doubt, copy and zip your entire Max Pulse folder before performing any software upgrades.</w:t>
+        <w:t xml:space="preserve">Very important- if you are upgrading from very old software  (for example 1.0.0.3 series software) to the latest version, it is possible your patient database will not transfer. If in doubt, copy and zip your entire Silvernorth Pulse HRV folder before performing any software upgrades.</w:t>
       </w:r>
     </w:p>
     <w:p>
@@ -8544,7 +8544,7 @@
         <w:pStyle w:val="Heading1"/>
       </w:pPr>
       <w:r>
-        <w:t xml:space="preserve">Max Pulse Troubleshooting</w:t>
+        <w:t xml:space="preserve">Silvernorth Pulse HRV Troubleshooting</w:t>
       </w:r>
     </w:p>
     <w:bookmarkStart w:id="233" w:name="content"/>
@@ -8553,15 +8553,15 @@
         <w:pStyle w:val="FirstParagraph"/>
       </w:pPr>
       <w:r>
-        <w:t xml:space="preserve">The Max Pulse is solid state electronics and after over 7 years selling this device, we have yet to have a defective machine. Normally the issues with the device are almost always:</w:t>
-      </w:r>
-    </w:p>
-    <w:p>
-      <w:pPr>
-        <w:pStyle w:val="BodyText"/>
-      </w:pPr>
-      <w:r>
-        <w:t xml:space="preserve">A. The Max Pulse finger Probe</w:t>
+        <w:t xml:space="preserve">The Silvernorth Pulse HRV is solid state electronics and after over 7 years selling this device, we have yet to have a defective machine. Normally the issues with the device are almost always:</w:t>
+      </w:r>
+    </w:p>
+    <w:p>
+      <w:pPr>
+        <w:pStyle w:val="BodyText"/>
+      </w:pPr>
+      <w:r>
+        <w:t xml:space="preserve">A. The Silvernorth Pulse HRV finger Probe</w:t>
       </w:r>
     </w:p>
     <w:p>
@@ -8603,7 +8603,7 @@
         <w:t xml:space="preserve"> </w:t>
       </w:r>
       <w:r>
-        <w:t xml:space="preserve">Make sure all the connections are tight and that the Max Pulse is switched on. If the Max Pulse has power, there will be a green light inside the on/off switch on the right side of the device. Then close the software and reopen it.</w:t>
+        <w:t xml:space="preserve">Make sure all the connections are tight and that the Silvernorth Pulse HRV is switched on. If the Silvernorth Pulse HRV has power, there will be a green light inside the on/off switch on the right side of the device. Then close the software and reopen it.</w:t>
       </w:r>
     </w:p>
     <w:p>
@@ -8621,7 +8621,7 @@
         <w:t xml:space="preserve"> </w:t>
       </w:r>
       <w:r>
-        <w:t xml:space="preserve">The Max Pulse software needed to be opened after the Max Pulse is connected and turned on, otherwise the software fails to detect the device, even if its switched on later. The Max Pulse does not need to be powered down at night. However if the Max Pulse is switched off at any time, then the software must also be closed. When starting the machine, the Max Pulse must be switched on first. Then the software should be opened. This allows the software to detect the Max Pulse.</w:t>
+        <w:t xml:space="preserve">The Silvernorth Pulse HRV software needed to be opened after the Silvernorth Pulse HRV is connected and turned on, otherwise the software fails to detect the device, even if its switched on later. The Silvernorth Pulse HRV does not need to be powered down at night. However if the Silvernorth Pulse HRV is switched off at any time, then the software must also be closed. When starting the machine, the Silvernorth Pulse HRV must be switched on first. Then the software should be opened. This allows the software to detect the Silvernorth Pulse HRV.</w:t>
       </w:r>
     </w:p>
     <w:p>
@@ -8639,7 +8639,7 @@
         <w:t xml:space="preserve"> </w:t>
       </w:r>
       <w:r>
-        <w:t xml:space="preserve">If the software starts up, but does not register the heart beat after starting the software and putting on the finger probe the issue can be – 1) Max Pulse does not have power, check for a green light inside the on/off switch.  2) Computer did not find the Max Pulse – Check that all cords are connected and then open and close the software after you are sure the Max Pulse has power</w:t>
+        <w:t xml:space="preserve">If the software starts up, but does not register the heart beat after starting the software and putting on the finger probe the issue can be – 1) Silvernorth Pulse HRV does not have power, check for a green light inside the on/off switch.  2) Computer did not find the Silvernorth Pulse HRV – Check that all cords are connected and then open and close the software after you are sure the Silvernorth Pulse HRV has power</w:t>
       </w:r>
     </w:p>
     <w:p>
@@ -8654,7 +8654,7 @@
         <w:t xml:space="preserve">Is There A Green Light?</w:t>
       </w:r>
       <w:r>
-        <w:t xml:space="preserve"> There should be a green light on the power switch on the box. If this is not on, make sure the Max Pulse is plugged in, and also make sure the power cord is firmly connected. Check another power outlet to make sure there is power. If you cannot get the green light on, there may be an issue with your Max Pulse and you should contact us.</w:t>
+        <w:t xml:space="preserve"> There should be a green light on the power switch on the box. If this is not on, make sure the Silvernorth Pulse HRV is plugged in, and also make sure the power cord is firmly connected. Check another power outlet to make sure there is power. If you cannot get the green light on, there may be an issue with your Silvernorth Pulse HRV and you should contact us.</w:t>
       </w:r>
     </w:p>
     <w:p>
@@ -8672,7 +8672,7 @@
         <w:t xml:space="preserve"> </w:t>
       </w:r>
       <w:r>
-        <w:t xml:space="preserve">There should be a blue light on the USB cable where it goes into the Max Pulse. If this is not on, check that the cord is firmly plugged in to the Max Pulse and the computer. If you cannot get this light to turn on, you should get a new cord. If the machine is not under warranty you can order a generic “</w:t>
+        <w:t xml:space="preserve">There should be a blue light on the USB cable where it goes into the Silvernorth Pulse HRV. If this is not on, check that the cord is firmly plugged in to the Silvernorth Pulse HRV and the computer. If you cannot get this light to turn on, you should get a new cord. If the machine is not under warranty you can order a generic “</w:t>
       </w:r>
       <w:hyperlink r:id="rId232">
         <w:r>
@@ -8701,15 +8701,15 @@
         <w:t xml:space="preserve"> </w:t>
       </w:r>
       <w:r>
-        <w:t xml:space="preserve">Is the software starting up correctly or is there an issue with the software? If you have an issue with the software, we recommend installing the latest version. Software issues almost never caused by a problem with the Max Pulse hardware. Be sure that your computer is running an up-to-date version of Windows 10 and that the computer itself has been checked for viruses and the hard drive is not overfull. Click Here To Learn More About Software Support</w:t>
-      </w:r>
-    </w:p>
-    <w:p>
-      <w:pPr>
-        <w:pStyle w:val="BodyText"/>
-      </w:pPr>
-      <w:r>
-        <w:t xml:space="preserve">When uninstalling  the software, be sure to copy the Max Pulse directory into your documents folder. This will preserve your patient database and allow you to reload the records at a later date. Never uninstall the software without doing this first.</w:t>
+        <w:t xml:space="preserve">Is the software starting up correctly or is there an issue with the software? If you have an issue with the software, we recommend installing the latest version. Software issues almost never caused by a problem with the Silvernorth Pulse HRV hardware. Be sure that your computer is running an up-to-date version of Windows 10 and that the computer itself has been checked for viruses and the hard drive is not overfull. Click Here To Learn More About Software Support</w:t>
+      </w:r>
+    </w:p>
+    <w:p>
+      <w:pPr>
+        <w:pStyle w:val="BodyText"/>
+      </w:pPr>
+      <w:r>
+        <w:t xml:space="preserve">When uninstalling  the software, be sure to copy the Silvernorth Pulse HRV directory into your documents folder. This will preserve your patient database and allow you to reload the records at a later date. Never uninstall the software without doing this first.</w:t>
       </w:r>
     </w:p>
     <w:p>
@@ -8727,7 +8727,7 @@
         <w:t xml:space="preserve"> </w:t>
       </w:r>
       <w:r>
-        <w:t xml:space="preserve">Check that your Max Pulse is switched on (green light inside the power button). Then check that all connections are tight. Then, without turning off the Max Pulse, just open and close the software. See if this clears the error. If it does not, Windows Defender may be blocking the software. Go To Windows Defender, Go to Device Security, then Memory Integrity and switch this option off. This should clear the error. You will need to reboot after this. You may also need to go to the Device Manager, go to  Ports (COM &amp; LTP) and reinstall the driver for the US Serial Port. Also go to Universal Serial Bus Controllers, bottom the list &gt;USB Serial Converter and also reinstall the driver.</w:t>
+        <w:t xml:space="preserve">Check that your Silvernorth Pulse HRV is switched on (green light inside the power button). Then check that all connections are tight. Then, without turning off the Silvernorth Pulse HRV, just open and close the software. See if this clears the error. If it does not, Windows Defender may be blocking the software. Go To Windows Defender, Go to Device Security, then Memory Integrity and switch this option off. This should clear the error. You will need to reboot after this. You may also need to go to the Device Manager, go to  Ports (COM &amp; LTP) and reinstall the driver for the US Serial Port. Also go to Universal Serial Bus Controllers, bottom the list &gt;USB Serial Converter and also reinstall the driver.</w:t>
       </w:r>
     </w:p>
     <w:p>
@@ -8771,7 +8771,7 @@
         <w:pStyle w:val="Heading2"/>
       </w:pPr>
       <w:r>
-        <w:t xml:space="preserve">This website is operated by Long Life Cardio LLC, importer and distributor for the Max Pulse Arterial and Stress Testing Device.</w:t>
+        <w:t xml:space="preserve">This website is operated by Long Life Cardio LLC, importer and distributor for the Silvernorth Pulse HRV Arterial and Stress Testing Device.</w:t>
       </w:r>
     </w:p>
     <w:p>
@@ -8779,7 +8779,7 @@
         <w:pStyle w:val="FirstParagraph"/>
       </w:pPr>
       <w:r>
-        <w:t xml:space="preserve">The Manufacturer of the Max Pulse does not provide software updates or copies of the software. You must contact the distributor you purchased the machine from for software support. If you cannot reach your original distributor for any reason, see below for instructions. All support is subject to our terms and conditions.</w:t>
+        <w:t xml:space="preserve">The Manufacturer of the Silvernorth Pulse HRV does not provide software updates or copies of the software. You must contact the distributor you purchased the machine from for software support. If you cannot reach your original distributor for any reason, see below for instructions. All support is subject to our terms and conditions.</w:t>
       </w:r>
     </w:p>
     <w:p>
@@ -9005,7 +9005,7 @@
         <w:pStyle w:val="Compact"/>
       </w:pPr>
       <w:r>
-        <w:t xml:space="preserve">Print or otherwise export any reports you wish to have from your existing Max Pulse installation.</w:t>
+        <w:t xml:space="preserve">Print or otherwise export any reports you wish to have from your existing Silvernorth Pulse HRV installation.</w:t>
       </w:r>
     </w:p>
     <w:p>
@@ -9041,7 +9041,7 @@
         <w:pStyle w:val="Compact"/>
       </w:pPr>
       <w:r>
-        <w:t xml:space="preserve">Go to Windows Settings and uninstall your existing Max Pulse software. OPTIONAL: You may wish to leave your existing Max Pulse Software in place. In this case the new software install on top of the old software. Depending on what version you are upgrading from, this may result in all your records transferring. If you chose this method and there are any unexpected errors with names and records, that means there is a database mis-match. You will need to completely uninstall the software, and reinstall. That will give you a clean install of the new software with none of the old Max Pulse test results.</w:t>
+        <w:t xml:space="preserve">Go to Windows Settings and uninstall your existing Silvernorth Pulse HRV software. OPTIONAL: You may wish to leave your existing Silvernorth Pulse HRV Software in place. In this case the new software install on top of the old software. Depending on what version you are upgrading from, this may result in all your records transferring. If you chose this method and there are any unexpected errors with names and records, that means there is a database mis-match. You will need to completely uninstall the software, and reinstall. That will give you a clean install of the new software with none of the old Silvernorth Pulse HRV test results.</w:t>
       </w:r>
     </w:p>
     <w:p>
@@ -9175,15 +9175,15 @@
         <w:t xml:space="preserve">Printing Options</w:t>
       </w:r>
       <w:r>
-        <w:t xml:space="preserve">: The Max Pulse will always print to whatever printer is setup as default in Windows. To set up a printer we recommend you go to Windows Settings, Devices and install the printer you want. Turn off the “Let Windows Manage My Printer” Option. Then set the default printer to whichever print you want. If you want to always save as PDF, then select Microsoft PDF as the default printer.</w:t>
-      </w:r>
-    </w:p>
-    <w:p>
-      <w:pPr>
-        <w:pStyle w:val="BodyText"/>
-      </w:pPr>
-      <w:r>
-        <w:t xml:space="preserve">But in all versions of the software from 6.0 and later, the setup window will give you the option have the Max Pulse send a copy of the report to the printer for the patient and also save an image of the report onto your hard drive.</w:t>
+        <w:t xml:space="preserve">: The Silvernorth Pulse HRV will always print to whatever printer is setup as default in Windows. To set up a printer we recommend you go to Windows Settings, Devices and install the printer you want. Turn off the “Let Windows Manage My Printer” Option. Then set the default printer to whichever print you want. If you want to always save as PDF, then select Microsoft PDF as the default printer.</w:t>
+      </w:r>
+    </w:p>
+    <w:p>
+      <w:pPr>
+        <w:pStyle w:val="BodyText"/>
+      </w:pPr>
+      <w:r>
+        <w:t xml:space="preserve">But in all versions of the software from 6.0 and later, the setup window will give you the option have the Silvernorth Pulse HRV send a copy of the report to the printer for the patient and also save an image of the report onto your hard drive.</w:t>
       </w:r>
     </w:p>
     <w:p>
@@ -9224,7 +9224,7 @@
         <w:t xml:space="preserve"> </w:t>
       </w:r>
       <w:r>
-        <w:t xml:space="preserve">– Will save an image of the report onto the hard drive. The folder where the image is saved (with the name of the patient and the date) is on the C drive&gt; MEDICORE&gt;MAX PULSE_GENERAL&gt; IMAGE. When using this it would be ideal to save a shortcut to that folder on the desktop.</w:t>
+        <w:t xml:space="preserve">– Will save an image of the report onto the hard drive. The folder where the image is saved (with the name of the patient and the date) is on the C drive&gt; MEDICORE&gt;SILVERNORTH PULSE HRV_GENERAL&gt; IMAGE. When using this it would be ideal to save a shortcut to that folder on the desktop.</w:t>
       </w:r>
     </w:p>
     <w:p>
@@ -9424,7 +9424,7 @@
         <w:pStyle w:val="Heading1"/>
       </w:pPr>
       <w:r>
-        <w:t xml:space="preserve">Max Pulse Testing Directory</w:t>
+        <w:t xml:space="preserve">Silvernorth Pulse HRV Testing Directory</w:t>
       </w:r>
     </w:p>
     <w:bookmarkStart w:id="249" w:name="content"/>
@@ -9433,7 +9433,7 @@
         <w:pStyle w:val="FirstParagraph"/>
       </w:pPr>
       <w:r>
-        <w:t xml:space="preserve">You might have found our website looking for someone to give you the Max Pulse test. There is no directory for this, so we have decided to start one.</w:t>
+        <w:t xml:space="preserve">You might have found our website looking for someone to give you the Silvernorth Pulse HRV test. There is no directory for this, so we have decided to start one.</w:t>
       </w:r>
     </w:p>
     <w:p>
@@ -9449,7 +9449,7 @@
         <w:pStyle w:val="BodyText"/>
       </w:pPr>
       <w:r>
-        <w:t xml:space="preserve">Max Pulse Directory</w:t>
+        <w:t xml:space="preserve">Silvernorth Pulse HRV Directory</w:t>
       </w:r>
     </w:p>
     <w:p>
@@ -10131,7 +10131,7 @@
           <w:bCs/>
           <w:b/>
         </w:rPr>
-        <w:t xml:space="preserve">(Over 20 Locations In Atlanta Offering Max Pulse Testing)</w:t>
+        <w:t xml:space="preserve">(Over 20 Locations In Atlanta Offering Silvernorth Pulse HRV Testing)</w:t>
       </w:r>
     </w:p>
     <w:p>
@@ -12493,7 +12493,7 @@
         <w:pStyle w:val="FirstParagraph"/>
       </w:pPr>
       <w:r>
-        <w:t xml:space="preserve">Thank you for your interest in the Max Pulse Device.</w:t>
+        <w:t xml:space="preserve">Thank you for your interest in the Silvernorth Pulse HRV Device.</w:t>
       </w:r>
     </w:p>
     <w:p>
@@ -12589,15 +12589,15 @@
         <w:pStyle w:val="BodyText"/>
       </w:pPr>
       <w:r>
-        <w:t xml:space="preserve">The purpose of this website and any provided documentation both here on this website or provided with the devices shipped to the customer is to promote consumer understanding and knowledge of the way the Max Pulse operates. Information given is generic and not a substitute for professional medical advice, diagnosis or treatment.</w:t>
-      </w:r>
-    </w:p>
-    <w:p>
-      <w:pPr>
-        <w:pStyle w:val="BodyText"/>
-      </w:pPr>
-      <w:r>
-        <w:t xml:space="preserve">The Max Pulse is an assessment tool only. Final diagnosis is the responsibility of a licensed practitioner.</w:t>
+        <w:t xml:space="preserve">The purpose of this website and any provided documentation both here on this website or provided with the devices shipped to the customer is to promote consumer understanding and knowledge of the way the Silvernorth Pulse HRV operates. Information given is generic and not a substitute for professional medical advice, diagnosis or treatment.</w:t>
+      </w:r>
+    </w:p>
+    <w:p>
+      <w:pPr>
+        <w:pStyle w:val="BodyText"/>
+      </w:pPr>
+      <w:r>
+        <w:t xml:space="preserve">The Silvernorth Pulse HRV is an assessment tool only. Final diagnosis is the responsibility of a licensed practitioner.</w:t>
       </w:r>
       <w:r>
         <w:t xml:space="preserve"> </w:t>
@@ -12634,7 +12634,7 @@
         <w:pStyle w:val="BodyText"/>
       </w:pPr>
       <w:r>
-        <w:t xml:space="preserve">The Max Pulse is a Class II medical device approved by the FDA.</w:t>
+        <w:t xml:space="preserve">The Silvernorth Pulse HRV is a Class II medical device approved by the FDA.</w:t>
       </w:r>
     </w:p>
     <w:p>
@@ -13134,7 +13134,7 @@
           <w:bCs/>
           <w:b/>
         </w:rPr>
-        <w:t xml:space="preserve">Damaged Max Pulse</w:t>
+        <w:t xml:space="preserve">Damaged Silvernorth Pulse HRV</w:t>
       </w:r>
     </w:p>
     <w:p>
@@ -13145,7 +13145,7 @@
         <w:t xml:space="preserve">I</w:t>
       </w:r>
       <w:r>
-        <w:t xml:space="preserve">f Customer receives a damaged Max Pulse it</w:t>
+        <w:t xml:space="preserve">f Customer receives a damaged Silvernorth Pulse HRV it</w:t>
       </w:r>
       <w:r>
         <w:t xml:space="preserve"> </w:t>
@@ -13903,7 +13903,7 @@
         <w:pStyle w:val="BodyText"/>
       </w:pPr>
       <w:r>
-        <w:t xml:space="preserve">The Max Pulse is covered by a 12 month manufacturers warranty. Long Life Cardio will extend the warranty to 5 years on all devices that are purchased or leases and Long Life Cardio will warranty all devices that are rented for the duration of the rental. The warranty only covers the physical Max Pulse device. Any laptop, accessories and software are not covered by warranty.</w:t>
+        <w:t xml:space="preserve">The Silvernorth Pulse HRV is covered by a 12 month manufacturers warranty. Long Life Cardio will extend the warranty to 5 years on all devices that are purchased or leases and Long Life Cardio will warranty all devices that are rented for the duration of the rental. The warranty only covers the physical Silvernorth Pulse HRV device. Any laptop, accessories and software are not covered by warranty.</w:t>
       </w:r>
     </w:p>
     <w:p>
@@ -13923,7 +13923,7 @@
         <w:pStyle w:val="BodyText"/>
       </w:pPr>
       <w:r>
-        <w:t xml:space="preserve">Purchaser will not reverse engineer, decompile, disassemble or otherwise attempt to derive the source code, techniques, processes, algorithms, know-how or other information from the binary code portions of the Max Pulse or Meridian DPA technology or permit or induce the foregoing. Purchaser will not reverse engineer, disassemble or otherwise attempt to derive the hardware, techniques, processes,  know-how or other information from the hardware portion of the Max Pulse or Meridian DPA technology or permit or induce the foregoing.</w:t>
+        <w:t xml:space="preserve">Purchaser will not reverse engineer, decompile, disassemble or otherwise attempt to derive the source code, techniques, processes, algorithms, know-how or other information from the binary code portions of the Silvernorth Pulse HRV or Meridian DPA technology or permit or induce the foregoing. Purchaser will not reverse engineer, disassemble or otherwise attempt to derive the hardware, techniques, processes,  know-how or other information from the hardware portion of the Silvernorth Pulse HRV or Meridian DPA technology or permit or induce the foregoing.</w:t>
       </w:r>
     </w:p>
     <w:p>
@@ -13943,7 +13943,7 @@
         <w:pStyle w:val="BodyText"/>
       </w:pPr>
       <w:r>
-        <w:t xml:space="preserve">Any customer accepting a leased or rented Max Pulse authorizes LONG LIFE CARDIO to assess a late fee of 5% on any and all unpaid balances 30 days after Lessee’s receipt of invoice. If the balance is not paid after reasonable efforts to collect the unpaid balance and accrued late fees; and if an unpaid balance remains unpaid for sixty (60) days or more, Lessee authorizes LONG LIFE CARDIO to exercise its right to terminate the lease or rental, remove the Max Pulse  from Lessee’s possession, and undertake legal action to recover the unpaid balance, late fees, attorney fees, court cost, and interest at the highest legal rate. If the Max Pulse cannot be recovered, customer agrees to pay LONG LIFE CARDIO the full retail price of the equipment and to undertake legal action to recover this payment including attorney fees, court costs, and any other costs associated with the rented or leased Max Pulse. Rentals and leases are only offered to established medical practices in the state of Texas and only at the discretion of Long Life Cardio. Requests for lease or rent may be declined without specific cause.</w:t>
+        <w:t xml:space="preserve">Any customer accepting a leased or rented Silvernorth Pulse HRV authorizes LONG LIFE CARDIO to assess a late fee of 5% on any and all unpaid balances 30 days after Lessee’s receipt of invoice. If the balance is not paid after reasonable efforts to collect the unpaid balance and accrued late fees; and if an unpaid balance remains unpaid for sixty (60) days or more, Lessee authorizes LONG LIFE CARDIO to exercise its right to terminate the lease or rental, remove the Silvernorth Pulse HRV  from Lessee’s possession, and undertake legal action to recover the unpaid balance, late fees, attorney fees, court cost, and interest at the highest legal rate. If the Silvernorth Pulse HRV cannot be recovered, customer agrees to pay LONG LIFE CARDIO the full retail price of the equipment and to undertake legal action to recover this payment including attorney fees, court costs, and any other costs associated with the rented or leased Silvernorth Pulse HRV. Rentals and leases are only offered to established medical practices in the state of Texas and only at the discretion of Long Life Cardio. Requests for lease or rent may be declined without specific cause.</w:t>
       </w:r>
     </w:p>
     <w:p>
@@ -13963,7 +13963,7 @@
         <w:pStyle w:val="BodyText"/>
       </w:pPr>
       <w:r>
-        <w:t xml:space="preserve">These Terms and Conditions, signed contracts and the customers invoice contain the entire agreement of the parties with respect to rental, lease or purchase of the Max Pulse  device.  These terms and conditions, signed contracts and the customer invoice supersede any prior agreements, understandings, or negotiations, whether written or oral.</w:t>
+        <w:t xml:space="preserve">These Terms and Conditions, signed contracts and the customers invoice contain the entire agreement of the parties with respect to rental, lease or purchase of the Silvernorth Pulse HRV  device.  These terms and conditions, signed contracts and the customer invoice supersede any prior agreements, understandings, or negotiations, whether written or oral.</w:t>
       </w:r>
     </w:p>
     <w:p>

</xml_diff>